<commit_message>
Doc: Modificação no escopo, pois teve mudança no nome do Dashboard e remoção da logo
</commit_message>
<xml_diff>
--- a/DECLARACAO_DO_ESCOPO_DO_PROJETO.docx
+++ b/DECLARACAO_DO_ESCOPO_DO_PROJETO.docx
@@ -127,7 +127,27 @@
                 <w:sz w:val="24"/>
                 <w:szCs w:val="24"/>
               </w:rPr>
-              <w:t>BOARD (Terra Fértil)</w:t>
+              <w:t>BOARD (</w:t>
+            </w:r>
+            <w:proofErr w:type="spellStart"/>
+            <w:r>
+              <w:rPr>
+                <w:rFonts w:ascii="Arial" w:hAnsi="Arial" w:cs="Arial"/>
+                <w:b/>
+                <w:sz w:val="24"/>
+                <w:szCs w:val="24"/>
+              </w:rPr>
+              <w:t>AgroFlux</w:t>
+            </w:r>
+            <w:proofErr w:type="spellEnd"/>
+            <w:r>
+              <w:rPr>
+                <w:rFonts w:ascii="Arial" w:hAnsi="Arial" w:cs="Arial"/>
+                <w:b/>
+                <w:sz w:val="24"/>
+                <w:szCs w:val="24"/>
+              </w:rPr>
+              <w:t>)</w:t>
             </w:r>
           </w:p>
           <w:p/>
@@ -146,73 +166,6 @@
             <w:pPr>
               <w:pStyle w:val="NormalWeb"/>
             </w:pPr>
-            <w:r>
-              <w:rPr>
-                <w:noProof/>
-              </w:rPr>
-              <w:drawing>
-                <wp:anchor distT="0" distB="0" distL="114300" distR="114300" simplePos="0" relativeHeight="251658240" behindDoc="0" locked="0" layoutInCell="1" allowOverlap="1">
-                  <wp:simplePos x="0" y="0"/>
-                  <wp:positionH relativeFrom="column">
-                    <wp:posOffset>352425</wp:posOffset>
-                  </wp:positionH>
-                  <wp:positionV relativeFrom="paragraph">
-                    <wp:posOffset>-1130935</wp:posOffset>
-                  </wp:positionV>
-                  <wp:extent cx="2232660" cy="2232660"/>
-                  <wp:effectExtent l="0" t="0" r="0" b="0"/>
-                  <wp:wrapNone/>
-                  <wp:docPr id="5" name="Imagem 5" descr="C:\Users\DTG-2025\Downloads\Green Illustrated Harvest Hill Logo (1)\2.png"/>
-                  <wp:cNvGraphicFramePr>
-                    <a:graphicFrameLocks xmlns:a="http://schemas.openxmlformats.org/drawingml/2006/main" noChangeAspect="1"/>
-                  </wp:cNvGraphicFramePr>
-                  <a:graphic xmlns:a="http://schemas.openxmlformats.org/drawingml/2006/main">
-                    <a:graphicData uri="http://schemas.openxmlformats.org/drawingml/2006/picture">
-                      <pic:pic xmlns:pic="http://schemas.openxmlformats.org/drawingml/2006/picture">
-                        <pic:nvPicPr>
-                          <pic:cNvPr id="0" name="Picture 18" descr="C:\Users\DTG-2025\Downloads\Green Illustrated Harvest Hill Logo (1)\2.png"/>
-                          <pic:cNvPicPr>
-                            <a:picLocks noChangeAspect="1" noChangeArrowheads="1"/>
-                          </pic:cNvPicPr>
-                        </pic:nvPicPr>
-                        <pic:blipFill>
-                          <a:blip r:embed="rId4">
-                            <a:extLst>
-                              <a:ext uri="{28A0092B-C50C-407E-A947-70E740481C1C}">
-                                <a14:useLocalDpi xmlns:a14="http://schemas.microsoft.com/office/drawing/2010/main" val="0"/>
-                              </a:ext>
-                            </a:extLst>
-                          </a:blip>
-                          <a:srcRect/>
-                          <a:stretch>
-                            <a:fillRect/>
-                          </a:stretch>
-                        </pic:blipFill>
-                        <pic:spPr bwMode="auto">
-                          <a:xfrm>
-                            <a:off x="0" y="0"/>
-                            <a:ext cx="2232660" cy="2232660"/>
-                          </a:xfrm>
-                          <a:prstGeom prst="rect">
-                            <a:avLst/>
-                          </a:prstGeom>
-                          <a:noFill/>
-                          <a:ln>
-                            <a:noFill/>
-                          </a:ln>
-                        </pic:spPr>
-                      </pic:pic>
-                    </a:graphicData>
-                  </a:graphic>
-                  <wp14:sizeRelH relativeFrom="margin">
-                    <wp14:pctWidth>0</wp14:pctWidth>
-                  </wp14:sizeRelH>
-                  <wp14:sizeRelV relativeFrom="margin">
-                    <wp14:pctHeight>0</wp14:pctHeight>
-                  </wp14:sizeRelV>
-                </wp:anchor>
-              </w:drawing>
-            </w:r>
             <w:r>
               <w:rPr>
                 <w:noProof/>
@@ -220,7 +173,7 @@
               <mc:AlternateContent>
                 <mc:Choice Requires="wps">
                   <w:drawing>
-                    <wp:inline distT="0" distB="0" distL="0" distR="0">
+                    <wp:inline distT="0" distB="0" distL="0" distR="0" wp14:anchorId="672445F2" wp14:editId="4B56FF5A">
                       <wp:extent cx="304800" cy="304800"/>
                       <wp:effectExtent l="0" t="0" r="0" b="0"/>
                       <wp:docPr id="1" name="Retângulo 1" descr="Green_Illustrated_Harvest_Hill_Logo.png"/>
@@ -276,7 +229,7 @@
                 </mc:Choice>
                 <mc:Fallback>
                   <w:pict>
-                    <v:rect w14:anchorId="4BF3745F" id="Retângulo 1" o:spid="_x0000_s1026" alt="Green_Illustrated_Harvest_Hill_Logo.png" style="width:24pt;height:24pt;visibility:visible;mso-wrap-style:square;mso-left-percent:-10001;mso-top-percent:-10001;mso-position-horizontal:absolute;mso-position-horizontal-relative:char;mso-position-vertical:absolute;mso-position-vertical-relative:line;mso-left-percent:-10001;mso-top-percent:-10001;v-text-anchor:top" o:gfxdata="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" filled="f" stroked="f">
+                    <v:rect w14:anchorId="3939F943" id="Retângulo 1" o:spid="_x0000_s1026" alt="Green_Illustrated_Harvest_Hill_Logo.png" style="width:24pt;height:24pt;visibility:visible;mso-wrap-style:square;mso-left-percent:-10001;mso-top-percent:-10001;mso-position-horizontal:absolute;mso-position-horizontal-relative:char;mso-position-vertical:absolute;mso-position-vertical-relative:line;mso-left-percent:-10001;mso-top-percent:-10001;v-text-anchor:top" o:gfxdata="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" filled="f" stroked="f">
                       <o:lock v:ext="edit" aspectratio="t"/>
                       <w10:anchorlock/>
                     </v:rect>
@@ -1014,8 +967,6 @@
             </w:r>
           </w:p>
         </w:tc>
-        <w:bookmarkStart w:id="0" w:name="_GoBack"/>
-        <w:bookmarkEnd w:id="0"/>
       </w:tr>
       <w:tr>
         <w:trPr>
@@ -1839,6 +1790,14 @@
           <w:szCs w:val="24"/>
         </w:rPr>
         <w:t>Transformando os dados brutos de campo em visibilidade estratégica, permitindo assim que os produtores e gestores tomem decisões rápidas sobre tratamentos de talhão, uso de maquinários e custos de produção</w:t>
+      </w:r>
+      <w:r>
+        <w:rPr>
+          <w:rFonts w:ascii="Arial" w:hAnsi="Arial" w:cs="Arial"/>
+          <w:sz w:val="24"/>
+          <w:szCs w:val="24"/>
+        </w:rPr>
+        <w:t>.</w:t>
       </w:r>
     </w:p>
     <w:p>
@@ -1995,7 +1954,27 @@
                 <w:sz w:val="24"/>
                 <w:szCs w:val="24"/>
               </w:rPr>
-              <w:t>CRIAÇÃO DO DESHBOARD (Terra Fértil)</w:t>
+              <w:t>CRIAÇÃO DO DESHBOARD (</w:t>
+            </w:r>
+            <w:proofErr w:type="spellStart"/>
+            <w:r>
+              <w:rPr>
+                <w:rFonts w:ascii="Arial" w:hAnsi="Arial" w:cs="Arial"/>
+                <w:b/>
+                <w:sz w:val="24"/>
+                <w:szCs w:val="24"/>
+              </w:rPr>
+              <w:t>AgroFlux</w:t>
+            </w:r>
+            <w:proofErr w:type="spellEnd"/>
+            <w:r>
+              <w:rPr>
+                <w:rFonts w:ascii="Arial" w:hAnsi="Arial" w:cs="Arial"/>
+                <w:b/>
+                <w:sz w:val="24"/>
+                <w:szCs w:val="24"/>
+              </w:rPr>
+              <w:t>)</w:t>
             </w:r>
           </w:p>
           <w:p/>
@@ -2014,73 +1993,8 @@
             <w:pPr>
               <w:pStyle w:val="NormalWeb"/>
             </w:pPr>
-            <w:r>
-              <w:rPr>
-                <w:noProof/>
-              </w:rPr>
-              <w:drawing>
-                <wp:anchor distT="0" distB="0" distL="114300" distR="114300" simplePos="0" relativeHeight="251660288" behindDoc="0" locked="0" layoutInCell="1" allowOverlap="1" wp14:anchorId="20639AB7" wp14:editId="28331016">
-                  <wp:simplePos x="0" y="0"/>
-                  <wp:positionH relativeFrom="column">
-                    <wp:posOffset>352425</wp:posOffset>
-                  </wp:positionH>
-                  <wp:positionV relativeFrom="paragraph">
-                    <wp:posOffset>-1130935</wp:posOffset>
-                  </wp:positionV>
-                  <wp:extent cx="2232660" cy="2232660"/>
-                  <wp:effectExtent l="0" t="0" r="0" b="0"/>
-                  <wp:wrapNone/>
-                  <wp:docPr id="11" name="Imagem 11" descr="C:\Users\DTG-2025\Downloads\Green Illustrated Harvest Hill Logo (1)\2.png"/>
-                  <wp:cNvGraphicFramePr>
-                    <a:graphicFrameLocks xmlns:a="http://schemas.openxmlformats.org/drawingml/2006/main" noChangeAspect="1"/>
-                  </wp:cNvGraphicFramePr>
-                  <a:graphic xmlns:a="http://schemas.openxmlformats.org/drawingml/2006/main">
-                    <a:graphicData uri="http://schemas.openxmlformats.org/drawingml/2006/picture">
-                      <pic:pic xmlns:pic="http://schemas.openxmlformats.org/drawingml/2006/picture">
-                        <pic:nvPicPr>
-                          <pic:cNvPr id="0" name="Picture 18" descr="C:\Users\DTG-2025\Downloads\Green Illustrated Harvest Hill Logo (1)\2.png"/>
-                          <pic:cNvPicPr>
-                            <a:picLocks noChangeAspect="1" noChangeArrowheads="1"/>
-                          </pic:cNvPicPr>
-                        </pic:nvPicPr>
-                        <pic:blipFill>
-                          <a:blip r:embed="rId4">
-                            <a:extLst>
-                              <a:ext uri="{28A0092B-C50C-407E-A947-70E740481C1C}">
-                                <a14:useLocalDpi xmlns:a14="http://schemas.microsoft.com/office/drawing/2010/main" val="0"/>
-                              </a:ext>
-                            </a:extLst>
-                          </a:blip>
-                          <a:srcRect/>
-                          <a:stretch>
-                            <a:fillRect/>
-                          </a:stretch>
-                        </pic:blipFill>
-                        <pic:spPr bwMode="auto">
-                          <a:xfrm>
-                            <a:off x="0" y="0"/>
-                            <a:ext cx="2232660" cy="2232660"/>
-                          </a:xfrm>
-                          <a:prstGeom prst="rect">
-                            <a:avLst/>
-                          </a:prstGeom>
-                          <a:noFill/>
-                          <a:ln>
-                            <a:noFill/>
-                          </a:ln>
-                        </pic:spPr>
-                      </pic:pic>
-                    </a:graphicData>
-                  </a:graphic>
-                  <wp14:sizeRelH relativeFrom="margin">
-                    <wp14:pctWidth>0</wp14:pctWidth>
-                  </wp14:sizeRelH>
-                  <wp14:sizeRelV relativeFrom="margin">
-                    <wp14:pctHeight>0</wp14:pctHeight>
-                  </wp14:sizeRelV>
-                </wp:anchor>
-              </w:drawing>
-            </w:r>
+            <w:bookmarkStart w:id="0" w:name="_GoBack"/>
+            <w:bookmarkEnd w:id="0"/>
             <w:r>
               <w:rPr>
                 <w:noProof/>
@@ -2088,7 +2002,7 @@
               <mc:AlternateContent>
                 <mc:Choice Requires="wps">
                   <w:drawing>
-                    <wp:inline distT="0" distB="0" distL="0" distR="0" wp14:anchorId="49FCD8E9" wp14:editId="041A2FF9">
+                    <wp:inline distT="0" distB="0" distL="0" distR="0" wp14:anchorId="49FCD8E9" wp14:editId="018BB17A">
                       <wp:extent cx="304800" cy="304800"/>
                       <wp:effectExtent l="0" t="0" r="0" b="0"/>
                       <wp:docPr id="10" name="Retângulo 10" descr="Green_Illustrated_Harvest_Hill_Logo.png"/>
@@ -2144,7 +2058,7 @@
                 </mc:Choice>
                 <mc:Fallback>
                   <w:pict>
-                    <v:rect w14:anchorId="0170FC60" id="Retângulo 10" o:spid="_x0000_s1026" alt="Green_Illustrated_Harvest_Hill_Logo.png" style="width:24pt;height:24pt;visibility:visible;mso-wrap-style:square;mso-left-percent:-10001;mso-top-percent:-10001;mso-position-horizontal:absolute;mso-position-horizontal-relative:char;mso-position-vertical:absolute;mso-position-vertical-relative:line;mso-left-percent:-10001;mso-top-percent:-10001;v-text-anchor:top" o:gfxdata="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" filled="f" stroked="f">
+                    <v:rect w14:anchorId="360D9A1E" id="Retângulo 10" o:spid="_x0000_s1026" alt="Green_Illustrated_Harvest_Hill_Logo.png" style="width:24pt;height:24pt;visibility:visible;mso-wrap-style:square;mso-left-percent:-10001;mso-top-percent:-10001;mso-position-horizontal:absolute;mso-position-horizontal-relative:char;mso-position-vertical:absolute;mso-position-vertical-relative:line;mso-left-percent:-10001;mso-top-percent:-10001;v-text-anchor:top" o:gfxdata="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" filled="f" stroked="f">
                       <o:lock v:ext="edit" aspectratio="t"/>
                       <w10:anchorlock/>
                     </v:rect>

</xml_diff>

<commit_message>
Doc: Adicionei o cronograma e os requisitos ao escopo
</commit_message>
<xml_diff>
--- a/DECLARACAO_DO_ESCOPO_DO_PROJETO.docx
+++ b/DECLARACAO_DO_ESCOPO_DO_PROJETO.docx
@@ -2,247 +2,16 @@
 <file path=word/document.xml><?xml version="1.0" encoding="utf-8"?>
 <w:document xmlns:wpc="http://schemas.microsoft.com/office/word/2010/wordprocessingCanvas" xmlns:cx="http://schemas.microsoft.com/office/drawing/2014/chartex" xmlns:cx1="http://schemas.microsoft.com/office/drawing/2015/9/8/chartex" xmlns:cx2="http://schemas.microsoft.com/office/drawing/2015/10/21/chartex" xmlns:cx3="http://schemas.microsoft.com/office/drawing/2016/5/9/chartex" xmlns:cx4="http://schemas.microsoft.com/office/drawing/2016/5/10/chartex" xmlns:cx5="http://schemas.microsoft.com/office/drawing/2016/5/11/chartex" xmlns:cx6="http://schemas.microsoft.com/office/drawing/2016/5/12/chartex" xmlns:cx7="http://schemas.microsoft.com/office/drawing/2016/5/13/chartex" xmlns:cx8="http://schemas.microsoft.com/office/drawing/2016/5/14/chartex" xmlns:mc="http://schemas.openxmlformats.org/markup-compatibility/2006" xmlns:aink="http://schemas.microsoft.com/office/drawing/2016/ink" xmlns:am3d="http://schemas.microsoft.com/office/drawing/2017/model3d" xmlns:o="urn:schemas-microsoft-com:office:office" xmlns:r="http://schemas.openxmlformats.org/officeDocument/2006/relationships" xmlns:m="http://schemas.openxmlformats.org/officeDocument/2006/math" xmlns:v="urn:schemas-microsoft-com:vml" xmlns:wp14="http://schemas.microsoft.com/office/word/2010/wordprocessingDrawing" xmlns:wp="http://schemas.openxmlformats.org/drawingml/2006/wordprocessingDrawing" xmlns:w10="urn:schemas-microsoft-com:office:word" xmlns:w="http://schemas.openxmlformats.org/wordprocessingml/2006/main" xmlns:w14="http://schemas.microsoft.com/office/word/2010/wordml" xmlns:w15="http://schemas.microsoft.com/office/word/2012/wordml" xmlns:w16cid="http://schemas.microsoft.com/office/word/2016/wordml/cid" xmlns:w16se="http://schemas.microsoft.com/office/word/2015/wordml/symex" xmlns:wpg="http://schemas.microsoft.com/office/word/2010/wordprocessingGroup" xmlns:wpi="http://schemas.microsoft.com/office/word/2010/wordprocessingInk" xmlns:wne="http://schemas.microsoft.com/office/word/2006/wordml" xmlns:wps="http://schemas.microsoft.com/office/word/2010/wordprocessingShape" mc:Ignorable="w14 w15 w16se w16cid wp14">
   <w:body>
-    <w:tbl>
-      <w:tblPr>
-        <w:tblStyle w:val="Tabelacomgrade"/>
-        <w:tblW w:w="9244" w:type="dxa"/>
-        <w:tblInd w:w="-5" w:type="dxa"/>
-        <w:tblLook w:val="04A0" w:firstRow="1" w:lastRow="0" w:firstColumn="1" w:lastColumn="0" w:noHBand="0" w:noVBand="1"/>
-      </w:tblPr>
-      <w:tblGrid>
-        <w:gridCol w:w="4536"/>
-        <w:gridCol w:w="4708"/>
-      </w:tblGrid>
-      <w:tr>
-        <w:trPr>
-          <w:trHeight w:val="1124"/>
-        </w:trPr>
-        <w:tc>
-          <w:tcPr>
-            <w:tcW w:w="4536" w:type="dxa"/>
-            <w:tcBorders>
-              <w:right w:val="single" w:sz="4" w:space="0" w:color="auto"/>
-            </w:tcBorders>
-          </w:tcPr>
-          <w:p>
-            <w:pPr>
-              <w:jc w:val="center"/>
-              <w:rPr>
-                <w:b/>
-              </w:rPr>
-            </w:pPr>
-          </w:p>
-          <w:p>
-            <w:pPr>
-              <w:jc w:val="center"/>
-              <w:rPr>
-                <w:rFonts w:ascii="Arial" w:hAnsi="Arial" w:cs="Arial"/>
-                <w:b/>
-                <w:sz w:val="24"/>
-                <w:szCs w:val="24"/>
-              </w:rPr>
-            </w:pPr>
-            <w:r>
-              <w:rPr>
-                <w:rFonts w:ascii="Arial" w:hAnsi="Arial" w:cs="Arial"/>
-                <w:b/>
-                <w:sz w:val="24"/>
-                <w:szCs w:val="24"/>
-              </w:rPr>
-              <w:t>DECLARAÇÃO DO ESCOPO DO</w:t>
-            </w:r>
-            <w:r>
-              <w:rPr>
-                <w:rFonts w:ascii="Arial" w:hAnsi="Arial" w:cs="Arial"/>
-                <w:b/>
-                <w:sz w:val="24"/>
-                <w:szCs w:val="24"/>
-              </w:rPr>
-              <w:t xml:space="preserve"> PROJETO</w:t>
-            </w:r>
-          </w:p>
-          <w:p>
-            <w:pPr>
-              <w:jc w:val="center"/>
-            </w:pPr>
-          </w:p>
-        </w:tc>
-        <w:tc>
-          <w:tcPr>
-            <w:tcW w:w="4708" w:type="dxa"/>
-            <w:tcBorders>
-              <w:top w:val="single" w:sz="4" w:space="0" w:color="auto"/>
-              <w:left w:val="single" w:sz="4" w:space="0" w:color="auto"/>
-              <w:bottom w:val="nil"/>
-              <w:right w:val="single" w:sz="4" w:space="0" w:color="auto"/>
-            </w:tcBorders>
-          </w:tcPr>
-          <w:p/>
-        </w:tc>
-      </w:tr>
-      <w:tr>
-        <w:trPr>
-          <w:trHeight w:val="599"/>
-        </w:trPr>
-        <w:tc>
-          <w:tcPr>
-            <w:tcW w:w="4536" w:type="dxa"/>
-            <w:tcBorders>
-              <w:right w:val="single" w:sz="4" w:space="0" w:color="auto"/>
-            </w:tcBorders>
-          </w:tcPr>
-          <w:p/>
-          <w:p>
-            <w:pPr>
-              <w:jc w:val="center"/>
-              <w:rPr>
-                <w:rFonts w:ascii="Arial" w:hAnsi="Arial" w:cs="Arial"/>
-                <w:b/>
-                <w:sz w:val="24"/>
-                <w:szCs w:val="24"/>
-              </w:rPr>
-            </w:pPr>
-            <w:r>
-              <w:rPr>
-                <w:rFonts w:ascii="Arial" w:hAnsi="Arial" w:cs="Arial"/>
-                <w:b/>
-                <w:sz w:val="24"/>
-                <w:szCs w:val="24"/>
-              </w:rPr>
-              <w:t>CRIAÇÃO DO DES</w:t>
-            </w:r>
-            <w:r>
-              <w:rPr>
-                <w:rFonts w:ascii="Arial" w:hAnsi="Arial" w:cs="Arial"/>
-                <w:b/>
-                <w:sz w:val="24"/>
-                <w:szCs w:val="24"/>
-              </w:rPr>
-              <w:t>H</w:t>
-            </w:r>
-            <w:r>
-              <w:rPr>
-                <w:rFonts w:ascii="Arial" w:hAnsi="Arial" w:cs="Arial"/>
-                <w:b/>
-                <w:sz w:val="24"/>
-                <w:szCs w:val="24"/>
-              </w:rPr>
-              <w:t>BOARD (</w:t>
-            </w:r>
-            <w:proofErr w:type="spellStart"/>
-            <w:r>
-              <w:rPr>
-                <w:rFonts w:ascii="Arial" w:hAnsi="Arial" w:cs="Arial"/>
-                <w:b/>
-                <w:sz w:val="24"/>
-                <w:szCs w:val="24"/>
-              </w:rPr>
-              <w:t>AgroFlux</w:t>
-            </w:r>
-            <w:proofErr w:type="spellEnd"/>
-            <w:r>
-              <w:rPr>
-                <w:rFonts w:ascii="Arial" w:hAnsi="Arial" w:cs="Arial"/>
-                <w:b/>
-                <w:sz w:val="24"/>
-                <w:szCs w:val="24"/>
-              </w:rPr>
-              <w:t>)</w:t>
-            </w:r>
-          </w:p>
-          <w:p/>
-        </w:tc>
-        <w:tc>
-          <w:tcPr>
-            <w:tcW w:w="4708" w:type="dxa"/>
-            <w:tcBorders>
-              <w:top w:val="nil"/>
-              <w:left w:val="single" w:sz="4" w:space="0" w:color="auto"/>
-              <w:bottom w:val="single" w:sz="4" w:space="0" w:color="auto"/>
-              <w:right w:val="single" w:sz="4" w:space="0" w:color="auto"/>
-            </w:tcBorders>
-          </w:tcPr>
-          <w:p>
-            <w:pPr>
-              <w:pStyle w:val="NormalWeb"/>
-            </w:pPr>
-            <w:r>
-              <w:rPr>
-                <w:noProof/>
-              </w:rPr>
-              <mc:AlternateContent>
-                <mc:Choice Requires="wps">
-                  <w:drawing>
-                    <wp:inline distT="0" distB="0" distL="0" distR="0" wp14:anchorId="672445F2" wp14:editId="4B56FF5A">
-                      <wp:extent cx="304800" cy="304800"/>
-                      <wp:effectExtent l="0" t="0" r="0" b="0"/>
-                      <wp:docPr id="1" name="Retângulo 1" descr="Green_Illustrated_Harvest_Hill_Logo.png"/>
-                      <wp:cNvGraphicFramePr>
-                        <a:graphicFrameLocks xmlns:a="http://schemas.openxmlformats.org/drawingml/2006/main" noChangeAspect="1"/>
-                      </wp:cNvGraphicFramePr>
-                      <a:graphic xmlns:a="http://schemas.openxmlformats.org/drawingml/2006/main">
-                        <a:graphicData uri="http://schemas.microsoft.com/office/word/2010/wordprocessingShape">
-                          <wps:wsp>
-                            <wps:cNvSpPr>
-                              <a:spLocks noChangeAspect="1" noChangeArrowheads="1"/>
-                            </wps:cNvSpPr>
-                            <wps:spPr bwMode="auto">
-                              <a:xfrm>
-                                <a:off x="0" y="0"/>
-                                <a:ext cx="304800" cy="304800"/>
-                              </a:xfrm>
-                              <a:prstGeom prst="rect">
-                                <a:avLst/>
-                              </a:prstGeom>
-                              <a:noFill/>
-                              <a:ln>
-                                <a:noFill/>
-                              </a:ln>
-                              <a:extLst>
-                                <a:ext uri="{909E8E84-426E-40DD-AFC4-6F175D3DCCD1}">
-                                  <a14:hiddenFill xmlns:a14="http://schemas.microsoft.com/office/drawing/2010/main">
-                                    <a:solidFill>
-                                      <a:srgbClr val="FFFFFF"/>
-                                    </a:solidFill>
-                                  </a14:hiddenFill>
-                                </a:ext>
-                                <a:ext uri="{91240B29-F687-4F45-9708-019B960494DF}">
-                                  <a14:hiddenLine xmlns:a14="http://schemas.microsoft.com/office/drawing/2010/main" w="9525">
-                                    <a:solidFill>
-                                      <a:srgbClr val="000000"/>
-                                    </a:solidFill>
-                                    <a:miter lim="800000"/>
-                                    <a:headEnd/>
-                                    <a:tailEnd/>
-                                  </a14:hiddenLine>
-                                </a:ext>
-                              </a:extLst>
-                            </wps:spPr>
-                            <wps:bodyPr rot="0" vert="horz" wrap="square" lIns="91440" tIns="45720" rIns="91440" bIns="45720" anchor="t" anchorCtr="0" upright="1">
-                              <a:noAutofit/>
-                            </wps:bodyPr>
-                          </wps:wsp>
-                        </a:graphicData>
-                      </a:graphic>
-                    </wp:inline>
-                  </w:drawing>
-                </mc:Choice>
-                <mc:Fallback>
-                  <w:pict>
-                    <v:rect w14:anchorId="3939F943" id="Retângulo 1" o:spid="_x0000_s1026" alt="Green_Illustrated_Harvest_Hill_Logo.png" style="width:24pt;height:24pt;visibility:visible;mso-wrap-style:square;mso-left-percent:-10001;mso-top-percent:-10001;mso-position-horizontal:absolute;mso-position-horizontal-relative:char;mso-position-vertical:absolute;mso-position-vertical-relative:line;mso-left-percent:-10001;mso-top-percent:-10001;v-text-anchor:top" o:gfxdata="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" filled="f" stroked="f">
-                      <o:lock v:ext="edit" aspectratio="t"/>
-                      <w10:anchorlock/>
-                    </v:rect>
-                  </w:pict>
-                </mc:Fallback>
-              </mc:AlternateContent>
-            </w:r>
-          </w:p>
-          <w:p/>
-        </w:tc>
-      </w:tr>
-    </w:tbl>
-    <w:p/>
+    <w:p>
+      <w:pPr>
+        <w:rPr>
+          <w:rFonts w:ascii="Times New Roman" w:hAnsi="Times New Roman" w:cs="Times New Roman"/>
+          <w:u w:val="single"/>
+        </w:rPr>
+      </w:pPr>
+      <w:bookmarkStart w:id="0" w:name="_GoBack"/>
+      <w:bookmarkEnd w:id="0"/>
+    </w:p>
     <w:tbl>
       <w:tblPr>
         <w:tblW w:w="8773" w:type="dxa"/>
@@ -283,7 +52,7 @@
               <w:spacing w:after="0" w:line="240" w:lineRule="auto"/>
               <w:jc w:val="center"/>
               <w:rPr>
-                <w:rFonts w:ascii="Arial" w:eastAsia="Times New Roman" w:hAnsi="Arial" w:cs="Arial"/>
+                <w:rFonts w:ascii="Times New Roman" w:eastAsia="Times New Roman" w:hAnsi="Times New Roman" w:cs="Times New Roman"/>
                 <w:b/>
                 <w:bCs/>
                 <w:color w:val="000000"/>
@@ -294,7 +63,7 @@
             </w:pPr>
             <w:r>
               <w:rPr>
-                <w:rFonts w:ascii="Arial" w:eastAsia="Times New Roman" w:hAnsi="Arial" w:cs="Arial"/>
+                <w:rFonts w:ascii="Times New Roman" w:eastAsia="Times New Roman" w:hAnsi="Times New Roman" w:cs="Times New Roman"/>
                 <w:b/>
                 <w:bCs/>
                 <w:color w:val="000000"/>
@@ -330,7 +99,7 @@
               <w:spacing w:after="0" w:line="240" w:lineRule="auto"/>
               <w:jc w:val="center"/>
               <w:rPr>
-                <w:rFonts w:ascii="Arial" w:eastAsia="Times New Roman" w:hAnsi="Arial" w:cs="Arial"/>
+                <w:rFonts w:ascii="Times New Roman" w:eastAsia="Times New Roman" w:hAnsi="Times New Roman" w:cs="Times New Roman"/>
                 <w:b/>
                 <w:bCs/>
                 <w:color w:val="000000"/>
@@ -341,7 +110,7 @@
             </w:pPr>
             <w:r>
               <w:rPr>
-                <w:rFonts w:ascii="Arial" w:eastAsia="Times New Roman" w:hAnsi="Arial" w:cs="Arial"/>
+                <w:rFonts w:ascii="Times New Roman" w:eastAsia="Times New Roman" w:hAnsi="Times New Roman" w:cs="Times New Roman"/>
                 <w:b/>
                 <w:bCs/>
                 <w:color w:val="000000"/>
@@ -372,7 +141,7 @@
               <w:spacing w:after="0" w:line="240" w:lineRule="auto"/>
               <w:jc w:val="center"/>
               <w:rPr>
-                <w:rFonts w:ascii="Arial" w:eastAsia="Times New Roman" w:hAnsi="Arial" w:cs="Arial"/>
+                <w:rFonts w:ascii="Times New Roman" w:eastAsia="Times New Roman" w:hAnsi="Times New Roman" w:cs="Times New Roman"/>
                 <w:b/>
                 <w:bCs/>
                 <w:color w:val="000000"/>
@@ -383,7 +152,7 @@
             </w:pPr>
             <w:r>
               <w:rPr>
-                <w:rFonts w:ascii="Arial" w:eastAsia="Times New Roman" w:hAnsi="Arial" w:cs="Arial"/>
+                <w:rFonts w:ascii="Times New Roman" w:eastAsia="Times New Roman" w:hAnsi="Times New Roman" w:cs="Times New Roman"/>
                 <w:b/>
                 <w:bCs/>
                 <w:color w:val="000000"/>
@@ -414,7 +183,7 @@
               <w:spacing w:after="0" w:line="240" w:lineRule="auto"/>
               <w:jc w:val="center"/>
               <w:rPr>
-                <w:rFonts w:ascii="Arial" w:eastAsia="Times New Roman" w:hAnsi="Arial" w:cs="Arial"/>
+                <w:rFonts w:ascii="Times New Roman" w:eastAsia="Times New Roman" w:hAnsi="Times New Roman" w:cs="Times New Roman"/>
                 <w:b/>
                 <w:bCs/>
                 <w:color w:val="000000"/>
@@ -425,7 +194,7 @@
             </w:pPr>
             <w:r>
               <w:rPr>
-                <w:rFonts w:ascii="Arial" w:eastAsia="Times New Roman" w:hAnsi="Arial" w:cs="Arial"/>
+                <w:rFonts w:ascii="Times New Roman" w:eastAsia="Times New Roman" w:hAnsi="Times New Roman" w:cs="Times New Roman"/>
                 <w:b/>
                 <w:bCs/>
                 <w:color w:val="000000"/>
@@ -456,7 +225,7 @@
               <w:spacing w:after="0" w:line="240" w:lineRule="auto"/>
               <w:jc w:val="center"/>
               <w:rPr>
-                <w:rFonts w:ascii="Arial" w:eastAsia="Times New Roman" w:hAnsi="Arial" w:cs="Arial"/>
+                <w:rFonts w:ascii="Times New Roman" w:eastAsia="Times New Roman" w:hAnsi="Times New Roman" w:cs="Times New Roman"/>
                 <w:b/>
                 <w:bCs/>
                 <w:color w:val="000000"/>
@@ -467,7 +236,7 @@
             </w:pPr>
             <w:r>
               <w:rPr>
-                <w:rFonts w:ascii="Arial" w:eastAsia="Times New Roman" w:hAnsi="Arial" w:cs="Arial"/>
+                <w:rFonts w:ascii="Times New Roman" w:eastAsia="Times New Roman" w:hAnsi="Times New Roman" w:cs="Times New Roman"/>
                 <w:b/>
                 <w:bCs/>
                 <w:color w:val="000000"/>
@@ -504,7 +273,7 @@
               <w:spacing w:after="0" w:line="240" w:lineRule="auto"/>
               <w:jc w:val="center"/>
               <w:rPr>
-                <w:rFonts w:ascii="Arial" w:eastAsia="Times New Roman" w:hAnsi="Arial" w:cs="Arial"/>
+                <w:rFonts w:ascii="Times New Roman" w:eastAsia="Times New Roman" w:hAnsi="Times New Roman" w:cs="Times New Roman"/>
                 <w:color w:val="000000"/>
                 <w:sz w:val="24"/>
                 <w:szCs w:val="24"/>
@@ -513,7 +282,7 @@
             </w:pPr>
             <w:r>
               <w:rPr>
-                <w:rFonts w:ascii="Arial" w:eastAsia="Times New Roman" w:hAnsi="Arial" w:cs="Arial"/>
+                <w:rFonts w:ascii="Times New Roman" w:eastAsia="Times New Roman" w:hAnsi="Times New Roman" w:cs="Times New Roman"/>
                 <w:color w:val="000000"/>
                 <w:sz w:val="24"/>
                 <w:szCs w:val="24"/>
@@ -543,7 +312,7 @@
               <w:spacing w:after="0" w:line="240" w:lineRule="auto"/>
               <w:jc w:val="center"/>
               <w:rPr>
-                <w:rFonts w:ascii="Arial" w:eastAsia="Times New Roman" w:hAnsi="Arial" w:cs="Arial"/>
+                <w:rFonts w:ascii="Times New Roman" w:eastAsia="Times New Roman" w:hAnsi="Times New Roman" w:cs="Times New Roman"/>
                 <w:color w:val="000000"/>
                 <w:sz w:val="24"/>
                 <w:szCs w:val="24"/>
@@ -552,7 +321,7 @@
             </w:pPr>
             <w:r>
               <w:rPr>
-                <w:rFonts w:ascii="Arial" w:eastAsia="Times New Roman" w:hAnsi="Arial" w:cs="Arial"/>
+                <w:rFonts w:ascii="Times New Roman" w:eastAsia="Times New Roman" w:hAnsi="Times New Roman" w:cs="Times New Roman"/>
                 <w:color w:val="000000"/>
                 <w:sz w:val="24"/>
                 <w:szCs w:val="24"/>
@@ -562,7 +331,7 @@
             </w:r>
             <w:r>
               <w:rPr>
-                <w:rFonts w:ascii="Arial" w:eastAsia="Times New Roman" w:hAnsi="Arial" w:cs="Arial"/>
+                <w:rFonts w:ascii="Times New Roman" w:eastAsia="Times New Roman" w:hAnsi="Times New Roman" w:cs="Times New Roman"/>
                 <w:color w:val="000000"/>
                 <w:sz w:val="24"/>
                 <w:szCs w:val="24"/>
@@ -591,7 +360,7 @@
               <w:spacing w:after="0" w:line="240" w:lineRule="auto"/>
               <w:jc w:val="center"/>
               <w:rPr>
-                <w:rFonts w:ascii="Arial" w:eastAsia="Times New Roman" w:hAnsi="Arial" w:cs="Arial"/>
+                <w:rFonts w:ascii="Times New Roman" w:eastAsia="Times New Roman" w:hAnsi="Times New Roman" w:cs="Times New Roman"/>
                 <w:color w:val="000000"/>
                 <w:sz w:val="24"/>
                 <w:szCs w:val="24"/>
@@ -600,7 +369,7 @@
             </w:pPr>
             <w:r>
               <w:rPr>
-                <w:rFonts w:ascii="Arial" w:eastAsia="Times New Roman" w:hAnsi="Arial" w:cs="Arial"/>
+                <w:rFonts w:ascii="Times New Roman" w:eastAsia="Times New Roman" w:hAnsi="Times New Roman" w:cs="Times New Roman"/>
                 <w:color w:val="000000"/>
                 <w:sz w:val="24"/>
                 <w:szCs w:val="24"/>
@@ -629,7 +398,7 @@
               <w:spacing w:after="0" w:line="240" w:lineRule="auto"/>
               <w:jc w:val="center"/>
               <w:rPr>
-                <w:rFonts w:ascii="Arial" w:eastAsia="Times New Roman" w:hAnsi="Arial" w:cs="Arial"/>
+                <w:rFonts w:ascii="Times New Roman" w:eastAsia="Times New Roman" w:hAnsi="Times New Roman" w:cs="Times New Roman"/>
                 <w:color w:val="000000"/>
                 <w:sz w:val="24"/>
                 <w:szCs w:val="24"/>
@@ -638,7 +407,7 @@
             </w:pPr>
             <w:r>
               <w:rPr>
-                <w:rFonts w:ascii="Arial" w:eastAsia="Times New Roman" w:hAnsi="Arial" w:cs="Arial"/>
+                <w:rFonts w:ascii="Times New Roman" w:eastAsia="Times New Roman" w:hAnsi="Times New Roman" w:cs="Times New Roman"/>
                 <w:color w:val="000000"/>
                 <w:sz w:val="24"/>
                 <w:szCs w:val="24"/>
@@ -648,7 +417,7 @@
             </w:r>
             <w:r>
               <w:rPr>
-                <w:rFonts w:ascii="Arial" w:eastAsia="Times New Roman" w:hAnsi="Arial" w:cs="Arial"/>
+                <w:rFonts w:ascii="Times New Roman" w:eastAsia="Times New Roman" w:hAnsi="Times New Roman" w:cs="Times New Roman"/>
                 <w:color w:val="000000"/>
                 <w:sz w:val="24"/>
                 <w:szCs w:val="24"/>
@@ -658,7 +427,7 @@
             </w:r>
             <w:r>
               <w:rPr>
-                <w:rFonts w:ascii="Arial" w:eastAsia="Times New Roman" w:hAnsi="Arial" w:cs="Arial"/>
+                <w:rFonts w:ascii="Times New Roman" w:eastAsia="Times New Roman" w:hAnsi="Times New Roman" w:cs="Times New Roman"/>
                 <w:color w:val="000000"/>
                 <w:sz w:val="24"/>
                 <w:szCs w:val="24"/>
@@ -690,7 +459,7 @@
             <w:pPr>
               <w:spacing w:after="0" w:line="240" w:lineRule="auto"/>
               <w:rPr>
-                <w:rFonts w:ascii="Arial" w:eastAsia="Times New Roman" w:hAnsi="Arial" w:cs="Arial"/>
+                <w:rFonts w:ascii="Times New Roman" w:eastAsia="Times New Roman" w:hAnsi="Times New Roman" w:cs="Times New Roman"/>
                 <w:color w:val="000000"/>
                 <w:sz w:val="24"/>
                 <w:szCs w:val="24"/>
@@ -716,7 +485,7 @@
             <w:pPr>
               <w:spacing w:after="0" w:line="240" w:lineRule="auto"/>
               <w:rPr>
-                <w:rFonts w:ascii="Arial" w:eastAsia="Times New Roman" w:hAnsi="Arial" w:cs="Arial"/>
+                <w:rFonts w:ascii="Times New Roman" w:eastAsia="Times New Roman" w:hAnsi="Times New Roman" w:cs="Times New Roman"/>
                 <w:color w:val="000000"/>
                 <w:sz w:val="24"/>
                 <w:szCs w:val="24"/>
@@ -742,7 +511,7 @@
             <w:pPr>
               <w:spacing w:after="0" w:line="240" w:lineRule="auto"/>
               <w:rPr>
-                <w:rFonts w:ascii="Arial" w:eastAsia="Times New Roman" w:hAnsi="Arial" w:cs="Arial"/>
+                <w:rFonts w:ascii="Times New Roman" w:eastAsia="Times New Roman" w:hAnsi="Times New Roman" w:cs="Times New Roman"/>
                 <w:color w:val="000000"/>
                 <w:sz w:val="24"/>
                 <w:szCs w:val="24"/>
@@ -768,7 +537,7 @@
             <w:pPr>
               <w:spacing w:after="0" w:line="240" w:lineRule="auto"/>
               <w:rPr>
-                <w:rFonts w:ascii="Arial" w:eastAsia="Times New Roman" w:hAnsi="Arial" w:cs="Arial"/>
+                <w:rFonts w:ascii="Times New Roman" w:eastAsia="Times New Roman" w:hAnsi="Times New Roman" w:cs="Times New Roman"/>
                 <w:color w:val="000000"/>
                 <w:sz w:val="24"/>
                 <w:szCs w:val="24"/>
@@ -802,7 +571,7 @@
               <w:spacing w:after="0" w:line="240" w:lineRule="auto"/>
               <w:jc w:val="center"/>
               <w:rPr>
-                <w:rFonts w:ascii="Arial" w:eastAsia="Times New Roman" w:hAnsi="Arial" w:cs="Arial"/>
+                <w:rFonts w:ascii="Times New Roman" w:eastAsia="Times New Roman" w:hAnsi="Times New Roman" w:cs="Times New Roman"/>
                 <w:color w:val="000000"/>
                 <w:sz w:val="24"/>
                 <w:szCs w:val="24"/>
@@ -811,7 +580,7 @@
             </w:pPr>
             <w:r>
               <w:rPr>
-                <w:rFonts w:ascii="Arial" w:eastAsia="Times New Roman" w:hAnsi="Arial" w:cs="Arial"/>
+                <w:rFonts w:ascii="Times New Roman" w:eastAsia="Times New Roman" w:hAnsi="Times New Roman" w:cs="Times New Roman"/>
                 <w:color w:val="000000"/>
                 <w:sz w:val="24"/>
                 <w:szCs w:val="24"/>
@@ -841,7 +610,7 @@
               <w:spacing w:after="0" w:line="240" w:lineRule="auto"/>
               <w:jc w:val="center"/>
               <w:rPr>
-                <w:rFonts w:ascii="Arial" w:eastAsia="Times New Roman" w:hAnsi="Arial" w:cs="Arial"/>
+                <w:rFonts w:ascii="Times New Roman" w:eastAsia="Times New Roman" w:hAnsi="Times New Roman" w:cs="Times New Roman"/>
                 <w:color w:val="000000"/>
                 <w:sz w:val="24"/>
                 <w:szCs w:val="24"/>
@@ -850,7 +619,7 @@
             </w:pPr>
             <w:r>
               <w:rPr>
-                <w:rFonts w:ascii="Arial" w:eastAsia="Times New Roman" w:hAnsi="Arial" w:cs="Arial"/>
+                <w:rFonts w:ascii="Times New Roman" w:eastAsia="Times New Roman" w:hAnsi="Times New Roman" w:cs="Times New Roman"/>
                 <w:color w:val="000000"/>
                 <w:sz w:val="24"/>
                 <w:szCs w:val="24"/>
@@ -860,7 +629,7 @@
             </w:r>
             <w:r>
               <w:rPr>
-                <w:rFonts w:ascii="Arial" w:eastAsia="Times New Roman" w:hAnsi="Arial" w:cs="Arial"/>
+                <w:rFonts w:ascii="Times New Roman" w:eastAsia="Times New Roman" w:hAnsi="Times New Roman" w:cs="Times New Roman"/>
                 <w:color w:val="000000"/>
                 <w:sz w:val="24"/>
                 <w:szCs w:val="24"/>
@@ -890,7 +659,7 @@
               <w:spacing w:after="0" w:line="240" w:lineRule="auto"/>
               <w:jc w:val="center"/>
               <w:rPr>
-                <w:rFonts w:ascii="Arial" w:eastAsia="Times New Roman" w:hAnsi="Arial" w:cs="Arial"/>
+                <w:rFonts w:ascii="Times New Roman" w:eastAsia="Times New Roman" w:hAnsi="Times New Roman" w:cs="Times New Roman"/>
                 <w:color w:val="000000"/>
                 <w:sz w:val="24"/>
                 <w:szCs w:val="24"/>
@@ -899,7 +668,7 @@
             </w:pPr>
             <w:r>
               <w:rPr>
-                <w:rFonts w:ascii="Arial" w:eastAsia="Times New Roman" w:hAnsi="Arial" w:cs="Arial"/>
+                <w:rFonts w:ascii="Times New Roman" w:eastAsia="Times New Roman" w:hAnsi="Times New Roman" w:cs="Times New Roman"/>
                 <w:color w:val="000000"/>
                 <w:sz w:val="24"/>
                 <w:szCs w:val="24"/>
@@ -928,7 +697,7 @@
               <w:spacing w:after="0" w:line="240" w:lineRule="auto"/>
               <w:jc w:val="center"/>
               <w:rPr>
-                <w:rFonts w:ascii="Arial" w:eastAsia="Times New Roman" w:hAnsi="Arial" w:cs="Arial"/>
+                <w:rFonts w:ascii="Times New Roman" w:eastAsia="Times New Roman" w:hAnsi="Times New Roman" w:cs="Times New Roman"/>
                 <w:color w:val="000000"/>
                 <w:sz w:val="24"/>
                 <w:szCs w:val="24"/>
@@ -937,7 +706,7 @@
             </w:pPr>
             <w:r>
               <w:rPr>
-                <w:rFonts w:ascii="Arial" w:eastAsia="Times New Roman" w:hAnsi="Arial" w:cs="Arial"/>
+                <w:rFonts w:ascii="Times New Roman" w:eastAsia="Times New Roman" w:hAnsi="Times New Roman" w:cs="Times New Roman"/>
                 <w:color w:val="000000"/>
                 <w:sz w:val="24"/>
                 <w:szCs w:val="24"/>
@@ -947,7 +716,7 @@
             </w:r>
             <w:r>
               <w:rPr>
-                <w:rFonts w:ascii="Arial" w:eastAsia="Times New Roman" w:hAnsi="Arial" w:cs="Arial"/>
+                <w:rFonts w:ascii="Times New Roman" w:eastAsia="Times New Roman" w:hAnsi="Times New Roman" w:cs="Times New Roman"/>
                 <w:color w:val="000000"/>
                 <w:sz w:val="24"/>
                 <w:szCs w:val="24"/>
@@ -957,7 +726,7 @@
             </w:r>
             <w:r>
               <w:rPr>
-                <w:rFonts w:ascii="Arial" w:eastAsia="Times New Roman" w:hAnsi="Arial" w:cs="Arial"/>
+                <w:rFonts w:ascii="Times New Roman" w:eastAsia="Times New Roman" w:hAnsi="Times New Roman" w:cs="Times New Roman"/>
                 <w:color w:val="000000"/>
                 <w:sz w:val="24"/>
                 <w:szCs w:val="24"/>
@@ -989,7 +758,7 @@
             <w:pPr>
               <w:spacing w:after="0" w:line="240" w:lineRule="auto"/>
               <w:rPr>
-                <w:rFonts w:ascii="Arial" w:eastAsia="Times New Roman" w:hAnsi="Arial" w:cs="Arial"/>
+                <w:rFonts w:ascii="Times New Roman" w:eastAsia="Times New Roman" w:hAnsi="Times New Roman" w:cs="Times New Roman"/>
                 <w:color w:val="000000"/>
                 <w:sz w:val="24"/>
                 <w:szCs w:val="24"/>
@@ -1015,7 +784,7 @@
             <w:pPr>
               <w:spacing w:after="0" w:line="240" w:lineRule="auto"/>
               <w:rPr>
-                <w:rFonts w:ascii="Arial" w:eastAsia="Times New Roman" w:hAnsi="Arial" w:cs="Arial"/>
+                <w:rFonts w:ascii="Times New Roman" w:eastAsia="Times New Roman" w:hAnsi="Times New Roman" w:cs="Times New Roman"/>
                 <w:color w:val="000000"/>
                 <w:sz w:val="24"/>
                 <w:szCs w:val="24"/>
@@ -1041,7 +810,7 @@
             <w:pPr>
               <w:spacing w:after="0" w:line="240" w:lineRule="auto"/>
               <w:rPr>
-                <w:rFonts w:ascii="Arial" w:eastAsia="Times New Roman" w:hAnsi="Arial" w:cs="Arial"/>
+                <w:rFonts w:ascii="Times New Roman" w:eastAsia="Times New Roman" w:hAnsi="Times New Roman" w:cs="Times New Roman"/>
                 <w:color w:val="000000"/>
                 <w:sz w:val="24"/>
                 <w:szCs w:val="24"/>
@@ -1067,7 +836,7 @@
             <w:pPr>
               <w:spacing w:after="0" w:line="240" w:lineRule="auto"/>
               <w:rPr>
-                <w:rFonts w:ascii="Arial" w:eastAsia="Times New Roman" w:hAnsi="Arial" w:cs="Arial"/>
+                <w:rFonts w:ascii="Times New Roman" w:eastAsia="Times New Roman" w:hAnsi="Times New Roman" w:cs="Times New Roman"/>
                 <w:color w:val="000000"/>
                 <w:sz w:val="24"/>
                 <w:szCs w:val="24"/>
@@ -1101,7 +870,7 @@
               <w:spacing w:after="0" w:line="240" w:lineRule="auto"/>
               <w:jc w:val="center"/>
               <w:rPr>
-                <w:rFonts w:ascii="Arial" w:eastAsia="Times New Roman" w:hAnsi="Arial" w:cs="Arial"/>
+                <w:rFonts w:ascii="Times New Roman" w:eastAsia="Times New Roman" w:hAnsi="Times New Roman" w:cs="Times New Roman"/>
                 <w:color w:val="000000"/>
                 <w:sz w:val="24"/>
                 <w:szCs w:val="24"/>
@@ -1110,7 +879,7 @@
             </w:pPr>
             <w:r>
               <w:rPr>
-                <w:rFonts w:ascii="Arial" w:eastAsia="Times New Roman" w:hAnsi="Arial" w:cs="Arial"/>
+                <w:rFonts w:ascii="Times New Roman" w:eastAsia="Times New Roman" w:hAnsi="Times New Roman" w:cs="Times New Roman"/>
                 <w:color w:val="000000"/>
                 <w:sz w:val="24"/>
                 <w:szCs w:val="24"/>
@@ -1140,7 +909,7 @@
               <w:spacing w:after="0" w:line="240" w:lineRule="auto"/>
               <w:jc w:val="center"/>
               <w:rPr>
-                <w:rFonts w:ascii="Arial" w:eastAsia="Times New Roman" w:hAnsi="Arial" w:cs="Arial"/>
+                <w:rFonts w:ascii="Times New Roman" w:eastAsia="Times New Roman" w:hAnsi="Times New Roman" w:cs="Times New Roman"/>
                 <w:color w:val="000000"/>
                 <w:sz w:val="24"/>
                 <w:szCs w:val="24"/>
@@ -1149,7 +918,7 @@
             </w:pPr>
             <w:r>
               <w:rPr>
-                <w:rFonts w:ascii="Arial" w:eastAsia="Times New Roman" w:hAnsi="Arial" w:cs="Arial"/>
+                <w:rFonts w:ascii="Times New Roman" w:eastAsia="Times New Roman" w:hAnsi="Times New Roman" w:cs="Times New Roman"/>
                 <w:color w:val="000000"/>
                 <w:sz w:val="24"/>
                 <w:szCs w:val="24"/>
@@ -1159,7 +928,7 @@
             </w:r>
             <w:r>
               <w:rPr>
-                <w:rFonts w:ascii="Arial" w:eastAsia="Times New Roman" w:hAnsi="Arial" w:cs="Arial"/>
+                <w:rFonts w:ascii="Times New Roman" w:eastAsia="Times New Roman" w:hAnsi="Times New Roman" w:cs="Times New Roman"/>
                 <w:color w:val="000000"/>
                 <w:sz w:val="24"/>
                 <w:szCs w:val="24"/>
@@ -1189,7 +958,7 @@
               <w:spacing w:after="0" w:line="240" w:lineRule="auto"/>
               <w:jc w:val="center"/>
               <w:rPr>
-                <w:rFonts w:ascii="Arial" w:eastAsia="Times New Roman" w:hAnsi="Arial" w:cs="Arial"/>
+                <w:rFonts w:ascii="Times New Roman" w:eastAsia="Times New Roman" w:hAnsi="Times New Roman" w:cs="Times New Roman"/>
                 <w:color w:val="000000"/>
                 <w:sz w:val="24"/>
                 <w:szCs w:val="24"/>
@@ -1198,7 +967,7 @@
             </w:pPr>
             <w:r>
               <w:rPr>
-                <w:rFonts w:ascii="Arial" w:eastAsia="Times New Roman" w:hAnsi="Arial" w:cs="Arial"/>
+                <w:rFonts w:ascii="Times New Roman" w:eastAsia="Times New Roman" w:hAnsi="Times New Roman" w:cs="Times New Roman"/>
                 <w:color w:val="000000"/>
                 <w:sz w:val="24"/>
                 <w:szCs w:val="24"/>
@@ -1227,7 +996,7 @@
               <w:spacing w:after="0" w:line="240" w:lineRule="auto"/>
               <w:jc w:val="center"/>
               <w:rPr>
-                <w:rFonts w:ascii="Arial" w:eastAsia="Times New Roman" w:hAnsi="Arial" w:cs="Arial"/>
+                <w:rFonts w:ascii="Times New Roman" w:eastAsia="Times New Roman" w:hAnsi="Times New Roman" w:cs="Times New Roman"/>
                 <w:color w:val="000000"/>
                 <w:sz w:val="24"/>
                 <w:szCs w:val="24"/>
@@ -1236,7 +1005,7 @@
             </w:pPr>
             <w:r>
               <w:rPr>
-                <w:rFonts w:ascii="Arial" w:eastAsia="Times New Roman" w:hAnsi="Arial" w:cs="Arial"/>
+                <w:rFonts w:ascii="Times New Roman" w:eastAsia="Times New Roman" w:hAnsi="Times New Roman" w:cs="Times New Roman"/>
                 <w:color w:val="000000"/>
                 <w:sz w:val="24"/>
                 <w:szCs w:val="24"/>
@@ -1246,7 +1015,7 @@
             </w:r>
             <w:r>
               <w:rPr>
-                <w:rFonts w:ascii="Arial" w:eastAsia="Times New Roman" w:hAnsi="Arial" w:cs="Arial"/>
+                <w:rFonts w:ascii="Times New Roman" w:eastAsia="Times New Roman" w:hAnsi="Times New Roman" w:cs="Times New Roman"/>
                 <w:color w:val="000000"/>
                 <w:sz w:val="24"/>
                 <w:szCs w:val="24"/>
@@ -1256,7 +1025,7 @@
             </w:r>
             <w:r>
               <w:rPr>
-                <w:rFonts w:ascii="Arial" w:eastAsia="Times New Roman" w:hAnsi="Arial" w:cs="Arial"/>
+                <w:rFonts w:ascii="Times New Roman" w:eastAsia="Times New Roman" w:hAnsi="Times New Roman" w:cs="Times New Roman"/>
                 <w:color w:val="000000"/>
                 <w:sz w:val="24"/>
                 <w:szCs w:val="24"/>
@@ -1288,7 +1057,7 @@
             <w:pPr>
               <w:spacing w:after="0" w:line="240" w:lineRule="auto"/>
               <w:rPr>
-                <w:rFonts w:ascii="Arial" w:eastAsia="Times New Roman" w:hAnsi="Arial" w:cs="Arial"/>
+                <w:rFonts w:ascii="Times New Roman" w:eastAsia="Times New Roman" w:hAnsi="Times New Roman" w:cs="Times New Roman"/>
                 <w:color w:val="000000"/>
                 <w:lang w:eastAsia="pt-BR"/>
               </w:rPr>
@@ -1312,7 +1081,7 @@
             <w:pPr>
               <w:spacing w:after="0" w:line="240" w:lineRule="auto"/>
               <w:rPr>
-                <w:rFonts w:ascii="Arial" w:eastAsia="Times New Roman" w:hAnsi="Arial" w:cs="Arial"/>
+                <w:rFonts w:ascii="Times New Roman" w:eastAsia="Times New Roman" w:hAnsi="Times New Roman" w:cs="Times New Roman"/>
                 <w:color w:val="000000"/>
                 <w:lang w:eastAsia="pt-BR"/>
               </w:rPr>
@@ -1336,7 +1105,7 @@
             <w:pPr>
               <w:spacing w:after="0" w:line="240" w:lineRule="auto"/>
               <w:rPr>
-                <w:rFonts w:ascii="Arial" w:eastAsia="Times New Roman" w:hAnsi="Arial" w:cs="Arial"/>
+                <w:rFonts w:ascii="Times New Roman" w:eastAsia="Times New Roman" w:hAnsi="Times New Roman" w:cs="Times New Roman"/>
                 <w:color w:val="000000"/>
                 <w:lang w:eastAsia="pt-BR"/>
               </w:rPr>
@@ -1360,7 +1129,7 @@
             <w:pPr>
               <w:spacing w:after="0" w:line="240" w:lineRule="auto"/>
               <w:rPr>
-                <w:rFonts w:ascii="Arial" w:eastAsia="Times New Roman" w:hAnsi="Arial" w:cs="Arial"/>
+                <w:rFonts w:ascii="Times New Roman" w:eastAsia="Times New Roman" w:hAnsi="Times New Roman" w:cs="Times New Roman"/>
                 <w:color w:val="000000"/>
                 <w:lang w:eastAsia="pt-BR"/>
               </w:rPr>
@@ -1389,7 +1158,7 @@
             <w:pPr>
               <w:spacing w:after="0" w:line="240" w:lineRule="auto"/>
               <w:rPr>
-                <w:rFonts w:ascii="Arial" w:eastAsia="Times New Roman" w:hAnsi="Arial" w:cs="Arial"/>
+                <w:rFonts w:ascii="Times New Roman" w:eastAsia="Times New Roman" w:hAnsi="Times New Roman" w:cs="Times New Roman"/>
                 <w:color w:val="000000"/>
                 <w:lang w:eastAsia="pt-BR"/>
               </w:rPr>
@@ -1413,7 +1182,7 @@
             <w:pPr>
               <w:spacing w:after="0" w:line="240" w:lineRule="auto"/>
               <w:rPr>
-                <w:rFonts w:ascii="Arial" w:eastAsia="Times New Roman" w:hAnsi="Arial" w:cs="Arial"/>
+                <w:rFonts w:ascii="Times New Roman" w:eastAsia="Times New Roman" w:hAnsi="Times New Roman" w:cs="Times New Roman"/>
                 <w:color w:val="000000"/>
                 <w:lang w:eastAsia="pt-BR"/>
               </w:rPr>
@@ -1437,7 +1206,7 @@
             <w:pPr>
               <w:spacing w:after="0" w:line="240" w:lineRule="auto"/>
               <w:rPr>
-                <w:rFonts w:ascii="Arial" w:eastAsia="Times New Roman" w:hAnsi="Arial" w:cs="Arial"/>
+                <w:rFonts w:ascii="Times New Roman" w:eastAsia="Times New Roman" w:hAnsi="Times New Roman" w:cs="Times New Roman"/>
                 <w:color w:val="000000"/>
                 <w:lang w:eastAsia="pt-BR"/>
               </w:rPr>
@@ -1461,7 +1230,7 @@
             <w:pPr>
               <w:spacing w:after="0" w:line="240" w:lineRule="auto"/>
               <w:rPr>
-                <w:rFonts w:ascii="Arial" w:eastAsia="Times New Roman" w:hAnsi="Arial" w:cs="Arial"/>
+                <w:rFonts w:ascii="Times New Roman" w:eastAsia="Times New Roman" w:hAnsi="Times New Roman" w:cs="Times New Roman"/>
                 <w:color w:val="000000"/>
                 <w:lang w:eastAsia="pt-BR"/>
               </w:rPr>
@@ -1490,7 +1259,7 @@
             <w:pPr>
               <w:spacing w:after="0" w:line="240" w:lineRule="auto"/>
               <w:rPr>
-                <w:rFonts w:ascii="Arial" w:eastAsia="Times New Roman" w:hAnsi="Arial" w:cs="Arial"/>
+                <w:rFonts w:ascii="Times New Roman" w:eastAsia="Times New Roman" w:hAnsi="Times New Roman" w:cs="Times New Roman"/>
                 <w:color w:val="000000"/>
                 <w:lang w:eastAsia="pt-BR"/>
               </w:rPr>
@@ -1514,7 +1283,7 @@
             <w:pPr>
               <w:spacing w:after="0" w:line="240" w:lineRule="auto"/>
               <w:rPr>
-                <w:rFonts w:ascii="Arial" w:eastAsia="Times New Roman" w:hAnsi="Arial" w:cs="Arial"/>
+                <w:rFonts w:ascii="Times New Roman" w:eastAsia="Times New Roman" w:hAnsi="Times New Roman" w:cs="Times New Roman"/>
                 <w:color w:val="000000"/>
                 <w:lang w:eastAsia="pt-BR"/>
               </w:rPr>
@@ -1538,7 +1307,7 @@
             <w:pPr>
               <w:spacing w:after="0" w:line="240" w:lineRule="auto"/>
               <w:rPr>
-                <w:rFonts w:ascii="Arial" w:eastAsia="Times New Roman" w:hAnsi="Arial" w:cs="Arial"/>
+                <w:rFonts w:ascii="Times New Roman" w:eastAsia="Times New Roman" w:hAnsi="Times New Roman" w:cs="Times New Roman"/>
                 <w:color w:val="000000"/>
                 <w:lang w:eastAsia="pt-BR"/>
               </w:rPr>
@@ -1562,7 +1331,7 @@
             <w:pPr>
               <w:spacing w:after="0" w:line="240" w:lineRule="auto"/>
               <w:rPr>
-                <w:rFonts w:ascii="Arial" w:eastAsia="Times New Roman" w:hAnsi="Arial" w:cs="Arial"/>
+                <w:rFonts w:ascii="Times New Roman" w:eastAsia="Times New Roman" w:hAnsi="Times New Roman" w:cs="Times New Roman"/>
                 <w:color w:val="000000"/>
                 <w:lang w:eastAsia="pt-BR"/>
               </w:rPr>
@@ -1574,7 +1343,7 @@
     <w:p>
       <w:pPr>
         <w:rPr>
-          <w:rFonts w:ascii="Arial" w:hAnsi="Arial" w:cs="Arial"/>
+          <w:rFonts w:ascii="Times New Roman" w:hAnsi="Times New Roman" w:cs="Times New Roman"/>
           <w:b/>
           <w:sz w:val="20"/>
           <w:szCs w:val="20"/>
@@ -1582,7 +1351,7 @@
       </w:pPr>
       <w:r>
         <w:rPr>
-          <w:rFonts w:ascii="Arial" w:hAnsi="Arial" w:cs="Arial"/>
+          <w:rFonts w:ascii="Times New Roman" w:hAnsi="Times New Roman" w:cs="Times New Roman"/>
           <w:b/>
           <w:sz w:val="20"/>
           <w:szCs w:val="20"/>
@@ -1590,580 +1359,855 @@
         <w:t>Fonte: Os autores</w:t>
       </w:r>
     </w:p>
-    <w:p/>
-    <w:p>
-      <w:pPr>
+    <w:p>
+      <w:pPr>
+        <w:rPr>
+          <w:rFonts w:ascii="Times New Roman" w:hAnsi="Times New Roman" w:cs="Times New Roman"/>
+        </w:rPr>
+      </w:pPr>
+    </w:p>
+    <w:p>
+      <w:pPr>
+        <w:spacing w:line="360" w:lineRule="auto"/>
+        <w:ind w:firstLine="709"/>
+        <w:rPr>
+          <w:rFonts w:ascii="Times New Roman" w:hAnsi="Times New Roman" w:cs="Times New Roman"/>
+          <w:b/>
+          <w:sz w:val="24"/>
+          <w:szCs w:val="24"/>
+        </w:rPr>
+      </w:pPr>
+      <w:r>
+        <w:rPr>
+          <w:rFonts w:ascii="Times New Roman" w:hAnsi="Times New Roman" w:cs="Times New Roman"/>
+          <w:b/>
+          <w:sz w:val="24"/>
+          <w:szCs w:val="24"/>
+        </w:rPr>
+        <w:t>Tema</w:t>
+      </w:r>
+      <w:r>
+        <w:rPr>
+          <w:rFonts w:ascii="Times New Roman" w:hAnsi="Times New Roman" w:cs="Times New Roman"/>
+          <w:b/>
+          <w:sz w:val="24"/>
+          <w:szCs w:val="24"/>
+        </w:rPr>
+        <w:t>/Justificativa</w:t>
+      </w:r>
+    </w:p>
+    <w:p>
+      <w:pPr>
+        <w:spacing w:line="360" w:lineRule="auto"/>
+        <w:ind w:firstLine="709"/>
+        <w:jc w:val="both"/>
+        <w:rPr>
+          <w:rFonts w:ascii="Times New Roman" w:hAnsi="Times New Roman" w:cs="Times New Roman"/>
+          <w:sz w:val="24"/>
+          <w:szCs w:val="24"/>
+        </w:rPr>
+      </w:pPr>
+      <w:r>
+        <w:rPr>
+          <w:rFonts w:ascii="Times New Roman" w:hAnsi="Times New Roman" w:cs="Times New Roman"/>
+          <w:sz w:val="24"/>
+          <w:szCs w:val="24"/>
+        </w:rPr>
+        <w:t xml:space="preserve">O tema escolhido pelo grupo </w:t>
+      </w:r>
+      <w:r>
+        <w:rPr>
+          <w:rFonts w:ascii="Times New Roman" w:hAnsi="Times New Roman" w:cs="Times New Roman"/>
+          <w:sz w:val="24"/>
+          <w:szCs w:val="24"/>
+        </w:rPr>
+        <w:t>está</w:t>
+      </w:r>
+      <w:r>
+        <w:rPr>
+          <w:rFonts w:ascii="Times New Roman" w:hAnsi="Times New Roman" w:cs="Times New Roman"/>
+          <w:sz w:val="24"/>
+          <w:szCs w:val="24"/>
+        </w:rPr>
+        <w:t xml:space="preserve"> relacionado a </w:t>
+      </w:r>
+      <w:r>
+        <w:rPr>
+          <w:rFonts w:ascii="Times New Roman" w:hAnsi="Times New Roman" w:cs="Times New Roman"/>
+          <w:sz w:val="24"/>
+          <w:szCs w:val="24"/>
+        </w:rPr>
+        <w:t xml:space="preserve">vendas para a área da </w:t>
+      </w:r>
+      <w:r>
+        <w:rPr>
+          <w:rFonts w:ascii="Times New Roman" w:hAnsi="Times New Roman" w:cs="Times New Roman"/>
+          <w:sz w:val="24"/>
+          <w:szCs w:val="24"/>
+        </w:rPr>
+        <w:t>agron</w:t>
+      </w:r>
+      <w:r>
+        <w:rPr>
+          <w:rFonts w:ascii="Times New Roman" w:hAnsi="Times New Roman" w:cs="Times New Roman"/>
+          <w:sz w:val="24"/>
+          <w:szCs w:val="24"/>
+        </w:rPr>
+        <w:t>omia</w:t>
+      </w:r>
+      <w:r>
+        <w:rPr>
+          <w:rFonts w:ascii="Times New Roman" w:hAnsi="Times New Roman" w:cs="Times New Roman"/>
+          <w:sz w:val="24"/>
+          <w:szCs w:val="24"/>
+        </w:rPr>
+        <w:t>,</w:t>
+      </w:r>
+      <w:r>
+        <w:rPr>
+          <w:rFonts w:ascii="Times New Roman" w:hAnsi="Times New Roman" w:cs="Times New Roman"/>
+          <w:sz w:val="24"/>
+          <w:szCs w:val="24"/>
+        </w:rPr>
+        <w:t xml:space="preserve"> porque</w:t>
+      </w:r>
+      <w:r>
+        <w:rPr>
+          <w:rFonts w:ascii="Times New Roman" w:hAnsi="Times New Roman" w:cs="Times New Roman"/>
+          <w:sz w:val="24"/>
+          <w:szCs w:val="24"/>
+        </w:rPr>
+        <w:t xml:space="preserve"> um dashboard funciona como um painel de controle centralizado que traduz a complexidade do campo em indicadores </w:t>
+      </w:r>
+      <w:r>
+        <w:rPr>
+          <w:rFonts w:ascii="Times New Roman" w:hAnsi="Times New Roman" w:cs="Times New Roman"/>
+          <w:sz w:val="24"/>
+          <w:szCs w:val="24"/>
+        </w:rPr>
+        <w:t>v</w:t>
+      </w:r>
+      <w:r>
+        <w:rPr>
+          <w:rFonts w:ascii="Times New Roman" w:hAnsi="Times New Roman" w:cs="Times New Roman"/>
+          <w:sz w:val="24"/>
+          <w:szCs w:val="24"/>
+        </w:rPr>
+        <w:t xml:space="preserve">isuais claros, permitindo assim uma gestão </w:t>
+      </w:r>
+      <w:r>
+        <w:rPr>
+          <w:rFonts w:ascii="Times New Roman" w:hAnsi="Times New Roman" w:cs="Times New Roman"/>
+          <w:sz w:val="24"/>
+          <w:szCs w:val="24"/>
+        </w:rPr>
+        <w:t xml:space="preserve">de produtos, funcionário, clientes, vendas, lucros e custos, </w:t>
+      </w:r>
+      <w:r>
+        <w:rPr>
+          <w:rFonts w:ascii="Times New Roman" w:hAnsi="Times New Roman" w:cs="Times New Roman"/>
+          <w:sz w:val="24"/>
+          <w:szCs w:val="24"/>
+        </w:rPr>
+        <w:t>baseada em dados em vez de suposições.</w:t>
+      </w:r>
+    </w:p>
+    <w:p>
+      <w:pPr>
+        <w:spacing w:line="360" w:lineRule="auto"/>
+        <w:ind w:firstLine="709"/>
+        <w:jc w:val="both"/>
+        <w:rPr>
+          <w:rFonts w:ascii="Times New Roman" w:hAnsi="Times New Roman" w:cs="Times New Roman"/>
+          <w:b/>
+          <w:sz w:val="24"/>
+          <w:szCs w:val="24"/>
+        </w:rPr>
+      </w:pPr>
+      <w:r>
+        <w:rPr>
+          <w:rFonts w:ascii="Times New Roman" w:hAnsi="Times New Roman" w:cs="Times New Roman"/>
+          <w:b/>
+          <w:sz w:val="24"/>
+          <w:szCs w:val="24"/>
+        </w:rPr>
+        <w:t>Objetivo</w:t>
+      </w:r>
+    </w:p>
+    <w:p>
+      <w:pPr>
+        <w:spacing w:line="360" w:lineRule="auto"/>
+        <w:ind w:firstLine="709"/>
+        <w:jc w:val="both"/>
+        <w:rPr>
+          <w:rFonts w:ascii="Times New Roman" w:hAnsi="Times New Roman" w:cs="Times New Roman"/>
+          <w:sz w:val="24"/>
+          <w:szCs w:val="24"/>
+        </w:rPr>
+      </w:pPr>
+      <w:r>
+        <w:rPr>
+          <w:rFonts w:ascii="Times New Roman" w:hAnsi="Times New Roman" w:cs="Times New Roman"/>
+          <w:sz w:val="24"/>
+          <w:szCs w:val="24"/>
+        </w:rPr>
+        <w:t xml:space="preserve">O objetivo principal da criação do dashboard </w:t>
+      </w:r>
+      <w:r>
+        <w:rPr>
+          <w:rFonts w:ascii="Times New Roman" w:hAnsi="Times New Roman" w:cs="Times New Roman"/>
+          <w:sz w:val="24"/>
+          <w:szCs w:val="24"/>
+        </w:rPr>
+        <w:t xml:space="preserve">para o agronegócio </w:t>
+      </w:r>
+      <w:r>
+        <w:rPr>
+          <w:rFonts w:ascii="Times New Roman" w:hAnsi="Times New Roman" w:cs="Times New Roman"/>
+          <w:sz w:val="24"/>
+          <w:szCs w:val="24"/>
+        </w:rPr>
+        <w:t xml:space="preserve">é facilitar e melhorar a visualização do proprietário com seu produto. </w:t>
+      </w:r>
+      <w:r>
+        <w:rPr>
+          <w:rFonts w:ascii="Times New Roman" w:hAnsi="Times New Roman" w:cs="Times New Roman"/>
+          <w:sz w:val="24"/>
+          <w:szCs w:val="24"/>
+        </w:rPr>
+        <w:t>Transformando os dados brutos de campo em visibilidade estratégica, permitindo assim que os produtores e gestores tomem decisões rápidas sobre tratamentos de talhão, uso de maquinários e custos de produção</w:t>
+      </w:r>
+      <w:r>
+        <w:rPr>
+          <w:rFonts w:ascii="Times New Roman" w:hAnsi="Times New Roman" w:cs="Times New Roman"/>
+          <w:sz w:val="24"/>
+          <w:szCs w:val="24"/>
+        </w:rPr>
+        <w:t>.</w:t>
+      </w:r>
+    </w:p>
+    <w:p>
+      <w:pPr>
+        <w:spacing w:line="360" w:lineRule="auto"/>
+        <w:ind w:firstLine="709"/>
+        <w:jc w:val="both"/>
+        <w:rPr>
+          <w:rFonts w:ascii="Times New Roman" w:hAnsi="Times New Roman" w:cs="Times New Roman"/>
+          <w:sz w:val="24"/>
+          <w:szCs w:val="24"/>
+        </w:rPr>
+      </w:pPr>
+    </w:p>
+    <w:p>
+      <w:pPr>
+        <w:spacing w:line="360" w:lineRule="auto"/>
+        <w:ind w:firstLine="709"/>
+        <w:jc w:val="both"/>
+        <w:rPr>
+          <w:rFonts w:ascii="Times New Roman" w:hAnsi="Times New Roman" w:cs="Times New Roman"/>
+          <w:sz w:val="24"/>
+          <w:szCs w:val="24"/>
+        </w:rPr>
+      </w:pPr>
+    </w:p>
+    <w:p>
+      <w:pPr>
+        <w:spacing w:line="360" w:lineRule="auto"/>
+        <w:ind w:firstLine="709"/>
+        <w:jc w:val="both"/>
+        <w:rPr>
+          <w:rFonts w:ascii="Times New Roman" w:hAnsi="Times New Roman" w:cs="Times New Roman"/>
+          <w:b/>
+          <w:sz w:val="24"/>
+          <w:szCs w:val="24"/>
+        </w:rPr>
+      </w:pPr>
+    </w:p>
+    <w:p>
+      <w:pPr>
+        <w:spacing w:line="360" w:lineRule="auto"/>
+        <w:ind w:firstLine="709"/>
+        <w:jc w:val="both"/>
+        <w:rPr>
+          <w:rFonts w:ascii="Times New Roman" w:hAnsi="Times New Roman" w:cs="Times New Roman"/>
+          <w:sz w:val="24"/>
+          <w:szCs w:val="24"/>
+        </w:rPr>
+      </w:pPr>
+      <w:r>
+        <w:rPr>
+          <w:rFonts w:ascii="Times New Roman" w:hAnsi="Times New Roman" w:cs="Times New Roman"/>
+          <w:b/>
+          <w:sz w:val="24"/>
+          <w:szCs w:val="24"/>
+        </w:rPr>
+        <w:t xml:space="preserve">Descrição do </w:t>
+      </w:r>
+      <w:r>
+        <w:rPr>
+          <w:rFonts w:ascii="Times New Roman" w:hAnsi="Times New Roman" w:cs="Times New Roman"/>
+          <w:b/>
+          <w:sz w:val="24"/>
+          <w:szCs w:val="24"/>
+        </w:rPr>
+        <w:t>projeto</w:t>
+      </w:r>
+    </w:p>
+    <w:p>
+      <w:pPr>
+        <w:spacing w:line="360" w:lineRule="auto"/>
+        <w:ind w:firstLine="709"/>
+        <w:jc w:val="both"/>
+        <w:rPr>
+          <w:rFonts w:ascii="Times New Roman" w:hAnsi="Times New Roman" w:cs="Times New Roman"/>
+          <w:sz w:val="24"/>
+          <w:szCs w:val="24"/>
+        </w:rPr>
+      </w:pPr>
+      <w:r>
+        <w:rPr>
+          <w:rFonts w:ascii="Times New Roman" w:hAnsi="Times New Roman" w:cs="Times New Roman"/>
+          <w:sz w:val="24"/>
+          <w:szCs w:val="24"/>
+        </w:rPr>
+        <w:t>Este dashboard tem como a principal finalidade na melhoria da visualização do proprietário com seu agronegócio, com uma interface visual projetada para consolidar dados complexos do campo em métricas de fácil leitura. Permitindo que o os produtores identifiquem rapidamente os melhores tratamentos para cada talhão e monitorem o desempenho da safra em tempo real.</w:t>
+      </w:r>
+    </w:p>
+    <w:p>
+      <w:pPr>
+        <w:spacing w:line="360" w:lineRule="auto"/>
+        <w:ind w:firstLine="709"/>
+        <w:jc w:val="both"/>
+        <w:rPr>
+          <w:rFonts w:ascii="Times New Roman" w:hAnsi="Times New Roman" w:cs="Times New Roman"/>
+        </w:rPr>
+      </w:pPr>
+    </w:p>
+    <w:p>
+      <w:pPr>
+        <w:spacing w:line="360" w:lineRule="auto"/>
+        <w:ind w:firstLine="709"/>
+        <w:jc w:val="both"/>
+        <w:rPr>
+          <w:rFonts w:ascii="Times New Roman" w:hAnsi="Times New Roman" w:cs="Times New Roman"/>
+          <w:b/>
+          <w:sz w:val="24"/>
+          <w:szCs w:val="24"/>
+        </w:rPr>
+      </w:pPr>
+      <w:r>
+        <w:rPr>
+          <w:rFonts w:ascii="Times New Roman" w:hAnsi="Times New Roman" w:cs="Times New Roman"/>
+          <w:b/>
+          <w:sz w:val="24"/>
+          <w:szCs w:val="24"/>
+        </w:rPr>
+        <w:t>Escopo do Trabalho</w:t>
+      </w:r>
+    </w:p>
+    <w:p>
+      <w:pPr>
+        <w:spacing w:line="360" w:lineRule="auto"/>
+        <w:ind w:firstLine="709"/>
+        <w:jc w:val="both"/>
+        <w:rPr>
+          <w:rFonts w:ascii="Times New Roman" w:hAnsi="Times New Roman" w:cs="Times New Roman"/>
+          <w:b/>
+          <w:sz w:val="24"/>
+          <w:szCs w:val="24"/>
+        </w:rPr>
+      </w:pPr>
+      <w:r>
+        <w:rPr>
+          <w:rFonts w:ascii="Times New Roman" w:hAnsi="Times New Roman" w:cs="Times New Roman"/>
+          <w:b/>
+          <w:sz w:val="24"/>
+          <w:szCs w:val="24"/>
+        </w:rPr>
+        <w:t xml:space="preserve">Tabela 1 - </w:t>
+      </w:r>
+      <w:r>
+        <w:rPr>
+          <w:rFonts w:ascii="Times New Roman" w:hAnsi="Times New Roman" w:cs="Times New Roman"/>
+          <w:b/>
+          <w:sz w:val="24"/>
+          <w:szCs w:val="24"/>
+        </w:rPr>
+        <w:t>Requisitos Funcionais</w:t>
+      </w:r>
+    </w:p>
+    <w:p>
+      <w:pPr>
+        <w:spacing w:line="360" w:lineRule="auto"/>
+        <w:ind w:firstLine="709"/>
+        <w:jc w:val="both"/>
         <w:rPr>
           <w:rFonts w:ascii="Arial" w:hAnsi="Arial" w:cs="Arial"/>
           <w:b/>
-          <w:sz w:val="24"/>
-          <w:szCs w:val="24"/>
         </w:rPr>
       </w:pPr>
       <w:r>
         <w:rPr>
           <w:rFonts w:ascii="Arial" w:hAnsi="Arial" w:cs="Arial"/>
           <w:b/>
-          <w:sz w:val="24"/>
-          <w:szCs w:val="24"/>
-        </w:rPr>
-        <w:t>Tema</w:t>
-      </w:r>
-      <w:r>
+          <w:noProof/>
+        </w:rPr>
+        <w:drawing>
+          <wp:inline distT="0" distB="0" distL="0" distR="0" wp14:anchorId="6E288727" wp14:editId="0872589A">
+            <wp:extent cx="3329940" cy="4175760"/>
+            <wp:effectExtent l="0" t="0" r="3810" b="0"/>
+            <wp:docPr id="4" name="Imagem 4"/>
+            <wp:cNvGraphicFramePr>
+              <a:graphicFrameLocks xmlns:a="http://schemas.openxmlformats.org/drawingml/2006/main" noChangeAspect="1"/>
+            </wp:cNvGraphicFramePr>
+            <a:graphic xmlns:a="http://schemas.openxmlformats.org/drawingml/2006/main">
+              <a:graphicData uri="http://schemas.openxmlformats.org/drawingml/2006/picture">
+                <pic:pic xmlns:pic="http://schemas.openxmlformats.org/drawingml/2006/picture">
+                  <pic:nvPicPr>
+                    <pic:cNvPr id="4" name="Captura de tela 2026-02-03 071657.png"/>
+                    <pic:cNvPicPr/>
+                  </pic:nvPicPr>
+                  <pic:blipFill>
+                    <a:blip r:embed="rId6">
+                      <a:extLst>
+                        <a:ext uri="{28A0092B-C50C-407E-A947-70E740481C1C}">
+                          <a14:useLocalDpi xmlns:a14="http://schemas.microsoft.com/office/drawing/2010/main" val="0"/>
+                        </a:ext>
+                      </a:extLst>
+                    </a:blip>
+                    <a:stretch>
+                      <a:fillRect/>
+                    </a:stretch>
+                  </pic:blipFill>
+                  <pic:spPr>
+                    <a:xfrm>
+                      <a:off x="0" y="0"/>
+                      <a:ext cx="3330430" cy="4176374"/>
+                    </a:xfrm>
+                    <a:prstGeom prst="rect">
+                      <a:avLst/>
+                    </a:prstGeom>
+                  </pic:spPr>
+                </pic:pic>
+              </a:graphicData>
+            </a:graphic>
+          </wp:inline>
+        </w:drawing>
+      </w:r>
+    </w:p>
+    <w:p>
+      <w:pPr>
+        <w:spacing w:line="240" w:lineRule="auto"/>
+        <w:ind w:firstLine="709"/>
+        <w:jc w:val="both"/>
         <w:rPr>
           <w:rFonts w:ascii="Arial" w:hAnsi="Arial" w:cs="Arial"/>
           <w:b/>
-          <w:sz w:val="24"/>
-          <w:szCs w:val="24"/>
-        </w:rPr>
-        <w:t>/Justificativa</w:t>
-      </w:r>
-    </w:p>
-    <w:p>
-      <w:pPr>
+        </w:rPr>
+      </w:pPr>
+      <w:r>
+        <w:rPr>
+          <w:rFonts w:ascii="Times New Roman" w:hAnsi="Times New Roman" w:cs="Times New Roman"/>
+          <w:b/>
+          <w:sz w:val="20"/>
+          <w:szCs w:val="20"/>
+        </w:rPr>
+        <w:t xml:space="preserve">Fonte: </w:t>
+      </w:r>
+      <w:r>
+        <w:rPr>
+          <w:rFonts w:ascii="Times New Roman" w:hAnsi="Times New Roman" w:cs="Times New Roman"/>
+          <w:sz w:val="20"/>
+          <w:szCs w:val="20"/>
+        </w:rPr>
+        <w:t>Os Autores</w:t>
+      </w:r>
+    </w:p>
+    <w:p>
+      <w:pPr>
+        <w:spacing w:line="360" w:lineRule="auto"/>
+        <w:ind w:firstLine="709"/>
+        <w:jc w:val="both"/>
+        <w:rPr>
+          <w:rFonts w:ascii="Times New Roman" w:hAnsi="Times New Roman" w:cs="Times New Roman"/>
+          <w:b/>
+          <w:sz w:val="24"/>
+          <w:szCs w:val="24"/>
+        </w:rPr>
+      </w:pPr>
+    </w:p>
+    <w:p>
+      <w:pPr>
+        <w:spacing w:line="360" w:lineRule="auto"/>
+        <w:ind w:firstLine="709"/>
+        <w:jc w:val="both"/>
+        <w:rPr>
+          <w:rFonts w:ascii="Times New Roman" w:hAnsi="Times New Roman" w:cs="Times New Roman"/>
+          <w:b/>
+          <w:sz w:val="24"/>
+          <w:szCs w:val="24"/>
+        </w:rPr>
+      </w:pPr>
+      <w:r>
+        <w:rPr>
+          <w:rFonts w:ascii="Times New Roman" w:hAnsi="Times New Roman" w:cs="Times New Roman"/>
+          <w:b/>
+          <w:sz w:val="24"/>
+          <w:szCs w:val="24"/>
+        </w:rPr>
+        <w:t>Tabela 2 – Requisitos Não Funcionais</w:t>
+      </w:r>
+    </w:p>
+    <w:p>
+      <w:pPr>
+        <w:spacing w:line="360" w:lineRule="auto"/>
+        <w:ind w:firstLine="709"/>
+        <w:jc w:val="both"/>
         <w:rPr>
           <w:rFonts w:ascii="Arial" w:hAnsi="Arial" w:cs="Arial"/>
-          <w:sz w:val="24"/>
-          <w:szCs w:val="24"/>
+          <w:b/>
         </w:rPr>
       </w:pPr>
       <w:r>
         <w:rPr>
           <w:rFonts w:ascii="Arial" w:hAnsi="Arial" w:cs="Arial"/>
-          <w:sz w:val="24"/>
-          <w:szCs w:val="24"/>
-        </w:rPr>
-        <w:t xml:space="preserve">O tema escolhido pelo grupo </w:t>
-      </w:r>
-      <w:r>
+          <w:b/>
+          <w:noProof/>
+        </w:rPr>
+        <w:drawing>
+          <wp:inline distT="0" distB="0" distL="0" distR="0" wp14:anchorId="06EAD1F7" wp14:editId="53D2201E">
+            <wp:extent cx="3360420" cy="3573145"/>
+            <wp:effectExtent l="0" t="0" r="0" b="8255"/>
+            <wp:docPr id="7" name="Imagem 7"/>
+            <wp:cNvGraphicFramePr>
+              <a:graphicFrameLocks xmlns:a="http://schemas.openxmlformats.org/drawingml/2006/main" noChangeAspect="1"/>
+            </wp:cNvGraphicFramePr>
+            <a:graphic xmlns:a="http://schemas.openxmlformats.org/drawingml/2006/main">
+              <a:graphicData uri="http://schemas.openxmlformats.org/drawingml/2006/picture">
+                <pic:pic xmlns:pic="http://schemas.openxmlformats.org/drawingml/2006/picture">
+                  <pic:nvPicPr>
+                    <pic:cNvPr id="7" name="Captura de tela 2026-02-03 072554.png"/>
+                    <pic:cNvPicPr/>
+                  </pic:nvPicPr>
+                  <pic:blipFill>
+                    <a:blip r:embed="rId7">
+                      <a:extLst>
+                        <a:ext uri="{28A0092B-C50C-407E-A947-70E740481C1C}">
+                          <a14:useLocalDpi xmlns:a14="http://schemas.microsoft.com/office/drawing/2010/main" val="0"/>
+                        </a:ext>
+                      </a:extLst>
+                    </a:blip>
+                    <a:stretch>
+                      <a:fillRect/>
+                    </a:stretch>
+                  </pic:blipFill>
+                  <pic:spPr>
+                    <a:xfrm>
+                      <a:off x="0" y="0"/>
+                      <a:ext cx="3368657" cy="3581903"/>
+                    </a:xfrm>
+                    <a:prstGeom prst="rect">
+                      <a:avLst/>
+                    </a:prstGeom>
+                  </pic:spPr>
+                </pic:pic>
+              </a:graphicData>
+            </a:graphic>
+          </wp:inline>
+        </w:drawing>
+      </w:r>
+    </w:p>
+    <w:p>
+      <w:pPr>
+        <w:spacing w:line="360" w:lineRule="auto"/>
+        <w:ind w:firstLine="709"/>
+        <w:jc w:val="both"/>
+        <w:rPr>
+          <w:rFonts w:ascii="Times New Roman" w:hAnsi="Times New Roman" w:cs="Times New Roman"/>
+          <w:sz w:val="20"/>
+          <w:szCs w:val="20"/>
+        </w:rPr>
+      </w:pPr>
+      <w:r>
+        <w:rPr>
+          <w:rFonts w:ascii="Times New Roman" w:hAnsi="Times New Roman" w:cs="Times New Roman"/>
+          <w:b/>
+          <w:sz w:val="20"/>
+          <w:szCs w:val="20"/>
+        </w:rPr>
+        <w:t xml:space="preserve">Fonte: </w:t>
+      </w:r>
+      <w:r>
+        <w:rPr>
+          <w:rFonts w:ascii="Times New Roman" w:hAnsi="Times New Roman" w:cs="Times New Roman"/>
+          <w:sz w:val="20"/>
+          <w:szCs w:val="20"/>
+        </w:rPr>
+        <w:t>Os Autores</w:t>
+      </w:r>
+    </w:p>
+    <w:p>
+      <w:pPr>
+        <w:spacing w:line="360" w:lineRule="auto"/>
+        <w:ind w:firstLine="709"/>
+        <w:jc w:val="both"/>
+        <w:rPr>
+          <w:rFonts w:ascii="Times New Roman" w:hAnsi="Times New Roman" w:cs="Times New Roman"/>
+          <w:sz w:val="20"/>
+          <w:szCs w:val="20"/>
+        </w:rPr>
+      </w:pPr>
+    </w:p>
+    <w:p>
+      <w:pPr>
+        <w:spacing w:line="360" w:lineRule="auto"/>
+        <w:ind w:firstLine="709"/>
+        <w:jc w:val="both"/>
+        <w:rPr>
+          <w:rFonts w:ascii="Times New Roman" w:hAnsi="Times New Roman" w:cs="Times New Roman"/>
+          <w:sz w:val="20"/>
+          <w:szCs w:val="20"/>
+        </w:rPr>
+      </w:pPr>
+    </w:p>
+    <w:p>
+      <w:pPr>
+        <w:spacing w:line="360" w:lineRule="auto"/>
+        <w:ind w:firstLine="709"/>
+        <w:jc w:val="both"/>
+        <w:rPr>
+          <w:rFonts w:ascii="Times New Roman" w:hAnsi="Times New Roman" w:cs="Times New Roman"/>
+          <w:sz w:val="20"/>
+          <w:szCs w:val="20"/>
+        </w:rPr>
+      </w:pPr>
+    </w:p>
+    <w:p>
+      <w:pPr>
+        <w:spacing w:line="360" w:lineRule="auto"/>
+        <w:ind w:firstLine="709"/>
+        <w:jc w:val="both"/>
+        <w:rPr>
+          <w:rFonts w:ascii="Times New Roman" w:hAnsi="Times New Roman" w:cs="Times New Roman"/>
+          <w:sz w:val="20"/>
+          <w:szCs w:val="20"/>
+        </w:rPr>
+      </w:pPr>
+    </w:p>
+    <w:p>
+      <w:pPr>
+        <w:spacing w:line="360" w:lineRule="auto"/>
+        <w:ind w:firstLine="709"/>
+        <w:jc w:val="both"/>
+        <w:rPr>
+          <w:rFonts w:ascii="Times New Roman" w:hAnsi="Times New Roman" w:cs="Times New Roman"/>
+          <w:sz w:val="20"/>
+          <w:szCs w:val="20"/>
+        </w:rPr>
+      </w:pPr>
+    </w:p>
+    <w:p>
+      <w:pPr>
+        <w:spacing w:line="360" w:lineRule="auto"/>
+        <w:ind w:firstLine="709"/>
+        <w:jc w:val="both"/>
+        <w:rPr>
+          <w:rFonts w:ascii="Times New Roman" w:hAnsi="Times New Roman" w:cs="Times New Roman"/>
+          <w:sz w:val="20"/>
+          <w:szCs w:val="20"/>
+        </w:rPr>
+      </w:pPr>
+    </w:p>
+    <w:p>
+      <w:pPr>
+        <w:spacing w:line="360" w:lineRule="auto"/>
+        <w:ind w:firstLine="709"/>
+        <w:jc w:val="both"/>
+        <w:rPr>
+          <w:rFonts w:ascii="Times New Roman" w:hAnsi="Times New Roman" w:cs="Times New Roman"/>
+          <w:sz w:val="20"/>
+          <w:szCs w:val="20"/>
+        </w:rPr>
+      </w:pPr>
+    </w:p>
+    <w:p>
+      <w:pPr>
+        <w:spacing w:line="360" w:lineRule="auto"/>
+        <w:ind w:firstLine="709"/>
+        <w:jc w:val="both"/>
+        <w:rPr>
+          <w:rFonts w:ascii="Times New Roman" w:hAnsi="Times New Roman" w:cs="Times New Roman"/>
+          <w:sz w:val="20"/>
+          <w:szCs w:val="20"/>
+        </w:rPr>
+      </w:pPr>
+    </w:p>
+    <w:p>
+      <w:pPr>
+        <w:spacing w:line="360" w:lineRule="auto"/>
+        <w:ind w:firstLine="709"/>
+        <w:jc w:val="both"/>
+        <w:rPr>
+          <w:rFonts w:ascii="Times New Roman" w:hAnsi="Times New Roman" w:cs="Times New Roman"/>
+          <w:sz w:val="20"/>
+          <w:szCs w:val="20"/>
+        </w:rPr>
+      </w:pPr>
+    </w:p>
+    <w:p>
+      <w:pPr>
+        <w:spacing w:line="360" w:lineRule="auto"/>
+        <w:ind w:firstLine="709"/>
+        <w:jc w:val="both"/>
+        <w:rPr>
+          <w:rFonts w:ascii="Times New Roman" w:hAnsi="Times New Roman" w:cs="Times New Roman"/>
+          <w:sz w:val="20"/>
+          <w:szCs w:val="20"/>
+        </w:rPr>
+      </w:pPr>
+    </w:p>
+    <w:p>
+      <w:pPr>
+        <w:spacing w:line="360" w:lineRule="auto"/>
+        <w:ind w:firstLine="709"/>
+        <w:jc w:val="both"/>
+        <w:rPr>
+          <w:rFonts w:ascii="Times New Roman" w:hAnsi="Times New Roman" w:cs="Times New Roman"/>
+          <w:b/>
+          <w:sz w:val="24"/>
+          <w:szCs w:val="24"/>
+        </w:rPr>
+      </w:pPr>
+      <w:r>
+        <w:rPr>
+          <w:rFonts w:ascii="Times New Roman" w:hAnsi="Times New Roman" w:cs="Times New Roman"/>
+          <w:b/>
+          <w:sz w:val="24"/>
+          <w:szCs w:val="24"/>
+        </w:rPr>
+        <w:t>Cronograma</w:t>
+      </w:r>
+    </w:p>
+    <w:p>
+      <w:pPr>
+        <w:spacing w:line="360" w:lineRule="auto"/>
+        <w:ind w:firstLine="709"/>
+        <w:jc w:val="both"/>
+        <w:rPr>
+          <w:rFonts w:ascii="Times New Roman" w:hAnsi="Times New Roman" w:cs="Times New Roman"/>
+          <w:b/>
+          <w:sz w:val="24"/>
+          <w:szCs w:val="24"/>
+        </w:rPr>
+      </w:pPr>
+      <w:r>
+        <w:rPr>
+          <w:rFonts w:ascii="Times New Roman" w:hAnsi="Times New Roman" w:cs="Times New Roman"/>
+          <w:b/>
+          <w:noProof/>
+          <w:sz w:val="24"/>
+          <w:szCs w:val="24"/>
+        </w:rPr>
+        <w:drawing>
+          <wp:inline distT="0" distB="0" distL="0" distR="0" wp14:anchorId="46E8996E" wp14:editId="20BF8B3B">
+            <wp:extent cx="4693920" cy="3627120"/>
+            <wp:effectExtent l="0" t="0" r="0" b="0"/>
+            <wp:docPr id="8" name="Imagem 8"/>
+            <wp:cNvGraphicFramePr>
+              <a:graphicFrameLocks xmlns:a="http://schemas.openxmlformats.org/drawingml/2006/main" noChangeAspect="1"/>
+            </wp:cNvGraphicFramePr>
+            <a:graphic xmlns:a="http://schemas.openxmlformats.org/drawingml/2006/main">
+              <a:graphicData uri="http://schemas.openxmlformats.org/drawingml/2006/picture">
+                <pic:pic xmlns:pic="http://schemas.openxmlformats.org/drawingml/2006/picture">
+                  <pic:nvPicPr>
+                    <pic:cNvPr id="8" name="Captura de tela 2026-02-03 073208.png"/>
+                    <pic:cNvPicPr/>
+                  </pic:nvPicPr>
+                  <pic:blipFill>
+                    <a:blip r:embed="rId8">
+                      <a:extLst>
+                        <a:ext uri="{28A0092B-C50C-407E-A947-70E740481C1C}">
+                          <a14:useLocalDpi xmlns:a14="http://schemas.microsoft.com/office/drawing/2010/main" val="0"/>
+                        </a:ext>
+                      </a:extLst>
+                    </a:blip>
+                    <a:stretch>
+                      <a:fillRect/>
+                    </a:stretch>
+                  </pic:blipFill>
+                  <pic:spPr>
+                    <a:xfrm>
+                      <a:off x="0" y="0"/>
+                      <a:ext cx="4693920" cy="3627120"/>
+                    </a:xfrm>
+                    <a:prstGeom prst="rect">
+                      <a:avLst/>
+                    </a:prstGeom>
+                  </pic:spPr>
+                </pic:pic>
+              </a:graphicData>
+            </a:graphic>
+          </wp:inline>
+        </w:drawing>
+      </w:r>
+    </w:p>
+    <w:p>
+      <w:pPr>
+        <w:spacing w:line="360" w:lineRule="auto"/>
+        <w:ind w:firstLine="709"/>
+        <w:jc w:val="both"/>
         <w:rPr>
           <w:rFonts w:ascii="Arial" w:hAnsi="Arial" w:cs="Arial"/>
-          <w:sz w:val="24"/>
-          <w:szCs w:val="24"/>
-        </w:rPr>
-        <w:t>está</w:t>
-      </w:r>
-      <w:r>
+          <w:b/>
+        </w:rPr>
+      </w:pPr>
+    </w:p>
+    <w:p>
+      <w:pPr>
+        <w:spacing w:line="360" w:lineRule="auto"/>
+        <w:ind w:firstLine="709"/>
+        <w:jc w:val="both"/>
         <w:rPr>
           <w:rFonts w:ascii="Arial" w:hAnsi="Arial" w:cs="Arial"/>
-          <w:sz w:val="24"/>
-          <w:szCs w:val="24"/>
-        </w:rPr>
-        <w:t xml:space="preserve"> relacionado a </w:t>
-      </w:r>
-      <w:r>
+          <w:b/>
+        </w:rPr>
+      </w:pPr>
+    </w:p>
+    <w:p>
+      <w:pPr>
+        <w:spacing w:line="360" w:lineRule="auto"/>
+        <w:ind w:firstLine="709"/>
+        <w:jc w:val="both"/>
         <w:rPr>
           <w:rFonts w:ascii="Arial" w:hAnsi="Arial" w:cs="Arial"/>
-          <w:sz w:val="24"/>
-          <w:szCs w:val="24"/>
-        </w:rPr>
-        <w:t xml:space="preserve">vendas para a área da </w:t>
-      </w:r>
-      <w:r>
+          <w:b/>
+        </w:rPr>
+      </w:pPr>
+    </w:p>
+    <w:p>
+      <w:pPr>
+        <w:spacing w:line="360" w:lineRule="auto"/>
+        <w:ind w:firstLine="709"/>
+        <w:jc w:val="both"/>
         <w:rPr>
           <w:rFonts w:ascii="Arial" w:hAnsi="Arial" w:cs="Arial"/>
-          <w:sz w:val="24"/>
-          <w:szCs w:val="24"/>
-        </w:rPr>
-        <w:t>agron</w:t>
-      </w:r>
-      <w:r>
+          <w:b/>
+        </w:rPr>
+      </w:pPr>
+    </w:p>
+    <w:p>
+      <w:pPr>
+        <w:spacing w:line="360" w:lineRule="auto"/>
+        <w:ind w:firstLine="709"/>
+        <w:jc w:val="both"/>
         <w:rPr>
           <w:rFonts w:ascii="Arial" w:hAnsi="Arial" w:cs="Arial"/>
-          <w:sz w:val="24"/>
-          <w:szCs w:val="24"/>
-        </w:rPr>
-        <w:t>omia</w:t>
-      </w:r>
-      <w:r>
-        <w:rPr>
-          <w:rFonts w:ascii="Arial" w:hAnsi="Arial" w:cs="Arial"/>
-          <w:sz w:val="24"/>
-          <w:szCs w:val="24"/>
-        </w:rPr>
-        <w:t>,</w:t>
-      </w:r>
-      <w:r>
-        <w:rPr>
-          <w:rFonts w:ascii="Arial" w:hAnsi="Arial" w:cs="Arial"/>
-          <w:sz w:val="24"/>
-          <w:szCs w:val="24"/>
-        </w:rPr>
-        <w:t xml:space="preserve"> porque</w:t>
-      </w:r>
-      <w:r>
-        <w:rPr>
-          <w:rFonts w:ascii="Arial" w:hAnsi="Arial" w:cs="Arial"/>
-          <w:sz w:val="24"/>
-          <w:szCs w:val="24"/>
-        </w:rPr>
-        <w:t xml:space="preserve"> um dashboard funciona como um painel de controle centralizado que traduz a complexidade do campo em indicadores </w:t>
-      </w:r>
-      <w:r>
-        <w:rPr>
-          <w:rFonts w:ascii="Arial" w:hAnsi="Arial" w:cs="Arial"/>
-          <w:sz w:val="24"/>
-          <w:szCs w:val="24"/>
-        </w:rPr>
-        <w:t>v</w:t>
-      </w:r>
-      <w:r>
-        <w:rPr>
-          <w:rFonts w:ascii="Arial" w:hAnsi="Arial" w:cs="Arial"/>
-          <w:sz w:val="24"/>
-          <w:szCs w:val="24"/>
-        </w:rPr>
-        <w:t xml:space="preserve">isuais claros, permitindo assim uma gestão </w:t>
-      </w:r>
-      <w:r>
-        <w:rPr>
-          <w:rFonts w:ascii="Arial" w:hAnsi="Arial" w:cs="Arial"/>
-          <w:sz w:val="24"/>
-          <w:szCs w:val="24"/>
-        </w:rPr>
-        <w:t xml:space="preserve">de produtos, funcionário, clientes, vendas, lucros e custos, </w:t>
-      </w:r>
-      <w:r>
-        <w:rPr>
-          <w:rFonts w:ascii="Arial" w:hAnsi="Arial" w:cs="Arial"/>
-          <w:sz w:val="24"/>
-          <w:szCs w:val="24"/>
-        </w:rPr>
-        <w:t>baseada em dados em vez de suposições.</w:t>
-      </w:r>
-    </w:p>
-    <w:p>
-      <w:pPr>
-        <w:rPr>
-          <w:rFonts w:ascii="Arial" w:hAnsi="Arial" w:cs="Arial"/>
-          <w:b/>
-          <w:sz w:val="24"/>
-          <w:szCs w:val="24"/>
-        </w:rPr>
-      </w:pPr>
-      <w:r>
-        <w:rPr>
-          <w:rFonts w:ascii="Arial" w:hAnsi="Arial" w:cs="Arial"/>
-          <w:b/>
-          <w:sz w:val="24"/>
-          <w:szCs w:val="24"/>
-        </w:rPr>
-        <w:t>Objetivo</w:t>
-      </w:r>
-    </w:p>
-    <w:p>
-      <w:pPr>
-        <w:rPr>
-          <w:rFonts w:ascii="Arial" w:hAnsi="Arial" w:cs="Arial"/>
-          <w:sz w:val="24"/>
-          <w:szCs w:val="24"/>
-        </w:rPr>
-      </w:pPr>
-      <w:r>
-        <w:rPr>
-          <w:rFonts w:ascii="Arial" w:hAnsi="Arial" w:cs="Arial"/>
-          <w:sz w:val="24"/>
-          <w:szCs w:val="24"/>
-        </w:rPr>
-        <w:t xml:space="preserve">O objetivo principal da criação do dashboard </w:t>
-      </w:r>
-      <w:r>
-        <w:rPr>
-          <w:rFonts w:ascii="Arial" w:hAnsi="Arial" w:cs="Arial"/>
-          <w:sz w:val="24"/>
-          <w:szCs w:val="24"/>
-        </w:rPr>
-        <w:t xml:space="preserve">para o agronegócio </w:t>
-      </w:r>
-      <w:r>
-        <w:rPr>
-          <w:rFonts w:ascii="Arial" w:hAnsi="Arial" w:cs="Arial"/>
-          <w:sz w:val="24"/>
-          <w:szCs w:val="24"/>
-        </w:rPr>
-        <w:t xml:space="preserve">é facilitar e melhorar a visualização do proprietário com seu produto. </w:t>
-      </w:r>
-      <w:r>
-        <w:rPr>
-          <w:rFonts w:ascii="Arial" w:hAnsi="Arial" w:cs="Arial"/>
-          <w:sz w:val="24"/>
-          <w:szCs w:val="24"/>
-        </w:rPr>
-        <w:t>Transformando os dados brutos de campo em visibilidade estratégica, permitindo assim que os produtores e gestores tomem decisões rápidas sobre tratamentos de talhão, uso de maquinários e custos de produção</w:t>
-      </w:r>
-      <w:r>
-        <w:rPr>
-          <w:rFonts w:ascii="Arial" w:hAnsi="Arial" w:cs="Arial"/>
-          <w:sz w:val="24"/>
-          <w:szCs w:val="24"/>
-        </w:rPr>
-        <w:t>.</w:t>
-      </w:r>
-    </w:p>
-    <w:p>
-      <w:pPr>
-        <w:rPr>
-          <w:rFonts w:ascii="Arial" w:hAnsi="Arial" w:cs="Arial"/>
-          <w:b/>
-          <w:sz w:val="24"/>
-          <w:szCs w:val="24"/>
-        </w:rPr>
-      </w:pPr>
-      <w:r>
-        <w:rPr>
-          <w:rFonts w:ascii="Arial" w:hAnsi="Arial" w:cs="Arial"/>
-          <w:b/>
-          <w:sz w:val="24"/>
-          <w:szCs w:val="24"/>
-        </w:rPr>
-        <w:t xml:space="preserve">Descrição do </w:t>
-      </w:r>
-      <w:r>
-        <w:rPr>
-          <w:rFonts w:ascii="Arial" w:hAnsi="Arial" w:cs="Arial"/>
-          <w:b/>
-          <w:sz w:val="24"/>
-          <w:szCs w:val="24"/>
-        </w:rPr>
-        <w:t>projeto</w:t>
-      </w:r>
-    </w:p>
-    <w:p>
-      <w:pPr>
-        <w:rPr>
-          <w:rFonts w:ascii="Arial" w:hAnsi="Arial" w:cs="Arial"/>
-          <w:sz w:val="24"/>
-          <w:szCs w:val="24"/>
-        </w:rPr>
-      </w:pPr>
-      <w:r>
-        <w:rPr>
-          <w:rFonts w:ascii="Arial" w:hAnsi="Arial" w:cs="Arial"/>
-          <w:sz w:val="24"/>
-          <w:szCs w:val="24"/>
-        </w:rPr>
-        <w:t xml:space="preserve">Este dashboard tem como a principal finalidade na melhoria da visualização do proprietário com seu agronegócio, com uma interface visual projetada para consolidar dados complexos do campo em métricas de fácil leitura. Permitindo </w:t>
-      </w:r>
-      <w:r>
-        <w:rPr>
-          <w:rFonts w:ascii="Arial" w:hAnsi="Arial" w:cs="Arial"/>
-          <w:sz w:val="24"/>
-          <w:szCs w:val="24"/>
-        </w:rPr>
-        <w:lastRenderedPageBreak/>
-        <w:t>que o os produtores identifiquem rapidamente os melhores tratamentos para cada talhão e monitorem o desempenho da safra em tempo real.</w:t>
-      </w:r>
-    </w:p>
-    <w:p/>
-    <w:p/>
-    <w:tbl>
-      <w:tblPr>
-        <w:tblStyle w:val="Tabelacomgrade"/>
-        <w:tblW w:w="9244" w:type="dxa"/>
-        <w:tblInd w:w="-5" w:type="dxa"/>
-        <w:tblLook w:val="04A0" w:firstRow="1" w:lastRow="0" w:firstColumn="1" w:lastColumn="0" w:noHBand="0" w:noVBand="1"/>
-      </w:tblPr>
-      <w:tblGrid>
-        <w:gridCol w:w="4536"/>
-        <w:gridCol w:w="4708"/>
-      </w:tblGrid>
-      <w:tr>
-        <w:trPr>
-          <w:trHeight w:val="1124"/>
-        </w:trPr>
-        <w:tc>
-          <w:tcPr>
-            <w:tcW w:w="4536" w:type="dxa"/>
-            <w:tcBorders>
-              <w:right w:val="single" w:sz="4" w:space="0" w:color="auto"/>
-            </w:tcBorders>
-          </w:tcPr>
-          <w:p>
-            <w:pPr>
-              <w:jc w:val="center"/>
-              <w:rPr>
-                <w:b/>
-              </w:rPr>
-            </w:pPr>
-          </w:p>
-          <w:p>
-            <w:pPr>
-              <w:jc w:val="center"/>
-              <w:rPr>
-                <w:rFonts w:ascii="Arial" w:hAnsi="Arial" w:cs="Arial"/>
-                <w:b/>
-                <w:sz w:val="24"/>
-                <w:szCs w:val="24"/>
-              </w:rPr>
-            </w:pPr>
-            <w:r>
-              <w:rPr>
-                <w:rFonts w:ascii="Arial" w:hAnsi="Arial" w:cs="Arial"/>
-                <w:b/>
-                <w:sz w:val="24"/>
-                <w:szCs w:val="24"/>
-              </w:rPr>
-              <w:t>DECLARAÇÃO DO ESCOPO DO PROJETO</w:t>
-            </w:r>
-          </w:p>
-          <w:p>
-            <w:pPr>
-              <w:jc w:val="center"/>
-            </w:pPr>
-          </w:p>
-        </w:tc>
-        <w:tc>
-          <w:tcPr>
-            <w:tcW w:w="4708" w:type="dxa"/>
-            <w:tcBorders>
-              <w:top w:val="single" w:sz="4" w:space="0" w:color="auto"/>
-              <w:left w:val="single" w:sz="4" w:space="0" w:color="auto"/>
-              <w:bottom w:val="nil"/>
-              <w:right w:val="single" w:sz="4" w:space="0" w:color="auto"/>
-            </w:tcBorders>
-          </w:tcPr>
-          <w:p/>
-        </w:tc>
-      </w:tr>
-      <w:tr>
-        <w:trPr>
-          <w:trHeight w:val="599"/>
-        </w:trPr>
-        <w:tc>
-          <w:tcPr>
-            <w:tcW w:w="4536" w:type="dxa"/>
-            <w:tcBorders>
-              <w:right w:val="single" w:sz="4" w:space="0" w:color="auto"/>
-            </w:tcBorders>
-          </w:tcPr>
-          <w:p/>
-          <w:p>
-            <w:pPr>
-              <w:jc w:val="center"/>
-              <w:rPr>
-                <w:rFonts w:ascii="Arial" w:hAnsi="Arial" w:cs="Arial"/>
-                <w:b/>
-                <w:sz w:val="24"/>
-                <w:szCs w:val="24"/>
-              </w:rPr>
-            </w:pPr>
-            <w:r>
-              <w:rPr>
-                <w:rFonts w:ascii="Arial" w:hAnsi="Arial" w:cs="Arial"/>
-                <w:b/>
-                <w:sz w:val="24"/>
-                <w:szCs w:val="24"/>
-              </w:rPr>
-              <w:t>CRIAÇÃO DO DESHBOARD (</w:t>
-            </w:r>
-            <w:proofErr w:type="spellStart"/>
-            <w:r>
-              <w:rPr>
-                <w:rFonts w:ascii="Arial" w:hAnsi="Arial" w:cs="Arial"/>
-                <w:b/>
-                <w:sz w:val="24"/>
-                <w:szCs w:val="24"/>
-              </w:rPr>
-              <w:t>AgroFlux</w:t>
-            </w:r>
-            <w:proofErr w:type="spellEnd"/>
-            <w:r>
-              <w:rPr>
-                <w:rFonts w:ascii="Arial" w:hAnsi="Arial" w:cs="Arial"/>
-                <w:b/>
-                <w:sz w:val="24"/>
-                <w:szCs w:val="24"/>
-              </w:rPr>
-              <w:t>)</w:t>
-            </w:r>
-          </w:p>
-          <w:p/>
-        </w:tc>
-        <w:tc>
-          <w:tcPr>
-            <w:tcW w:w="4708" w:type="dxa"/>
-            <w:tcBorders>
-              <w:top w:val="nil"/>
-              <w:left w:val="single" w:sz="4" w:space="0" w:color="auto"/>
-              <w:bottom w:val="single" w:sz="4" w:space="0" w:color="auto"/>
-              <w:right w:val="single" w:sz="4" w:space="0" w:color="auto"/>
-            </w:tcBorders>
-          </w:tcPr>
-          <w:p>
-            <w:pPr>
-              <w:pStyle w:val="NormalWeb"/>
-            </w:pPr>
-            <w:bookmarkStart w:id="0" w:name="_GoBack"/>
-            <w:bookmarkEnd w:id="0"/>
-            <w:r>
-              <w:rPr>
-                <w:noProof/>
-              </w:rPr>
-              <mc:AlternateContent>
-                <mc:Choice Requires="wps">
-                  <w:drawing>
-                    <wp:inline distT="0" distB="0" distL="0" distR="0" wp14:anchorId="49FCD8E9" wp14:editId="018BB17A">
-                      <wp:extent cx="304800" cy="304800"/>
-                      <wp:effectExtent l="0" t="0" r="0" b="0"/>
-                      <wp:docPr id="10" name="Retângulo 10" descr="Green_Illustrated_Harvest_Hill_Logo.png"/>
-                      <wp:cNvGraphicFramePr>
-                        <a:graphicFrameLocks xmlns:a="http://schemas.openxmlformats.org/drawingml/2006/main" noChangeAspect="1"/>
-                      </wp:cNvGraphicFramePr>
-                      <a:graphic xmlns:a="http://schemas.openxmlformats.org/drawingml/2006/main">
-                        <a:graphicData uri="http://schemas.microsoft.com/office/word/2010/wordprocessingShape">
-                          <wps:wsp>
-                            <wps:cNvSpPr>
-                              <a:spLocks noChangeAspect="1" noChangeArrowheads="1"/>
-                            </wps:cNvSpPr>
-                            <wps:spPr bwMode="auto">
-                              <a:xfrm>
-                                <a:off x="0" y="0"/>
-                                <a:ext cx="304800" cy="304800"/>
-                              </a:xfrm>
-                              <a:prstGeom prst="rect">
-                                <a:avLst/>
-                              </a:prstGeom>
-                              <a:noFill/>
-                              <a:ln>
-                                <a:noFill/>
-                              </a:ln>
-                              <a:extLst>
-                                <a:ext uri="{909E8E84-426E-40DD-AFC4-6F175D3DCCD1}">
-                                  <a14:hiddenFill xmlns:a14="http://schemas.microsoft.com/office/drawing/2010/main">
-                                    <a:solidFill>
-                                      <a:srgbClr val="FFFFFF"/>
-                                    </a:solidFill>
-                                  </a14:hiddenFill>
-                                </a:ext>
-                                <a:ext uri="{91240B29-F687-4F45-9708-019B960494DF}">
-                                  <a14:hiddenLine xmlns:a14="http://schemas.microsoft.com/office/drawing/2010/main" w="9525">
-                                    <a:solidFill>
-                                      <a:srgbClr val="000000"/>
-                                    </a:solidFill>
-                                    <a:miter lim="800000"/>
-                                    <a:headEnd/>
-                                    <a:tailEnd/>
-                                  </a14:hiddenLine>
-                                </a:ext>
-                              </a:extLst>
-                            </wps:spPr>
-                            <wps:bodyPr rot="0" vert="horz" wrap="square" lIns="91440" tIns="45720" rIns="91440" bIns="45720" anchor="t" anchorCtr="0" upright="1">
-                              <a:noAutofit/>
-                            </wps:bodyPr>
-                          </wps:wsp>
-                        </a:graphicData>
-                      </a:graphic>
-                    </wp:inline>
-                  </w:drawing>
-                </mc:Choice>
-                <mc:Fallback>
-                  <w:pict>
-                    <v:rect w14:anchorId="360D9A1E" id="Retângulo 10" o:spid="_x0000_s1026" alt="Green_Illustrated_Harvest_Hill_Logo.png" style="width:24pt;height:24pt;visibility:visible;mso-wrap-style:square;mso-left-percent:-10001;mso-top-percent:-10001;mso-position-horizontal:absolute;mso-position-horizontal-relative:char;mso-position-vertical:absolute;mso-position-vertical-relative:line;mso-left-percent:-10001;mso-top-percent:-10001;v-text-anchor:top" o:gfxdata="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" filled="f" stroked="f">
-                      <o:lock v:ext="edit" aspectratio="t"/>
-                      <w10:anchorlock/>
-                    </v:rect>
-                  </w:pict>
-                </mc:Fallback>
-              </mc:AlternateContent>
-            </w:r>
-          </w:p>
-          <w:p/>
-        </w:tc>
-      </w:tr>
-    </w:tbl>
-    <w:p/>
-    <w:p>
-      <w:pPr>
-        <w:rPr>
-          <w:rFonts w:ascii="Arial" w:hAnsi="Arial" w:cs="Arial"/>
-          <w:b/>
-          <w:sz w:val="24"/>
-          <w:szCs w:val="24"/>
-        </w:rPr>
-      </w:pPr>
-      <w:r>
-        <w:rPr>
-          <w:rFonts w:ascii="Arial" w:hAnsi="Arial" w:cs="Arial"/>
-          <w:b/>
-          <w:sz w:val="24"/>
-          <w:szCs w:val="24"/>
-        </w:rPr>
-        <w:t xml:space="preserve">Requisitos Funcionais e </w:t>
-      </w:r>
-      <w:r>
-        <w:rPr>
-          <w:rFonts w:ascii="Arial" w:hAnsi="Arial" w:cs="Arial"/>
-          <w:b/>
-          <w:sz w:val="24"/>
-          <w:szCs w:val="24"/>
-        </w:rPr>
-        <w:t>N</w:t>
-      </w:r>
-      <w:r>
-        <w:rPr>
-          <w:rFonts w:ascii="Arial" w:hAnsi="Arial" w:cs="Arial"/>
-          <w:b/>
-          <w:sz w:val="24"/>
-          <w:szCs w:val="24"/>
-        </w:rPr>
-        <w:t xml:space="preserve">ão </w:t>
-      </w:r>
-      <w:r>
-        <w:rPr>
-          <w:rFonts w:ascii="Arial" w:hAnsi="Arial" w:cs="Arial"/>
-          <w:b/>
-          <w:sz w:val="24"/>
-          <w:szCs w:val="24"/>
-        </w:rPr>
-        <w:t>F</w:t>
-      </w:r>
-      <w:r>
-        <w:rPr>
-          <w:rFonts w:ascii="Arial" w:hAnsi="Arial" w:cs="Arial"/>
-          <w:b/>
-          <w:sz w:val="24"/>
-          <w:szCs w:val="24"/>
-        </w:rPr>
-        <w:t>uncionais</w:t>
-      </w:r>
-    </w:p>
-    <w:p>
-      <w:pPr>
-        <w:rPr>
-          <w:rFonts w:ascii="Arial" w:hAnsi="Arial" w:cs="Arial"/>
-          <w:b/>
-          <w:sz w:val="24"/>
-          <w:szCs w:val="24"/>
-        </w:rPr>
-      </w:pPr>
-      <w:r>
-        <w:rPr>
-          <w:rFonts w:ascii="Arial" w:hAnsi="Arial" w:cs="Arial"/>
-          <w:b/>
-          <w:sz w:val="24"/>
-          <w:szCs w:val="24"/>
-        </w:rPr>
-        <w:t xml:space="preserve">Tabela 1 - </w:t>
-      </w:r>
-      <w:r>
-        <w:rPr>
-          <w:rFonts w:ascii="Arial" w:hAnsi="Arial" w:cs="Arial"/>
-          <w:b/>
-          <w:sz w:val="24"/>
-          <w:szCs w:val="24"/>
-        </w:rPr>
-        <w:t>Requisitos Funcionais</w:t>
-      </w:r>
-    </w:p>
-    <w:p>
-      <w:pPr>
-        <w:rPr>
-          <w:rFonts w:ascii="Arial" w:hAnsi="Arial" w:cs="Arial"/>
           <w:b/>
         </w:rPr>
       </w:pPr>
     </w:p>
     <w:sectPr>
+      <w:headerReference w:type="default" r:id="rId9"/>
       <w:pgSz w:w="11906" w:h="16838"/>
       <w:pgMar w:top="1417" w:right="1701" w:bottom="1417" w:left="1701" w:header="708" w:footer="708" w:gutter="0"/>
       <w:cols w:space="708"/>
@@ -2171,6 +2215,275 @@
     </w:sectPr>
   </w:body>
 </w:document>
+</file>
+
+<file path=word/endnotes.xml><?xml version="1.0" encoding="utf-8"?>
+<w:endnotes xmlns:wpc="http://schemas.microsoft.com/office/word/2010/wordprocessingCanvas" xmlns:cx="http://schemas.microsoft.com/office/drawing/2014/chartex" xmlns:cx1="http://schemas.microsoft.com/office/drawing/2015/9/8/chartex" xmlns:cx2="http://schemas.microsoft.com/office/drawing/2015/10/21/chartex" xmlns:cx3="http://schemas.microsoft.com/office/drawing/2016/5/9/chartex" xmlns:cx4="http://schemas.microsoft.com/office/drawing/2016/5/10/chartex" xmlns:cx5="http://schemas.microsoft.com/office/drawing/2016/5/11/chartex" xmlns:cx6="http://schemas.microsoft.com/office/drawing/2016/5/12/chartex" xmlns:cx7="http://schemas.microsoft.com/office/drawing/2016/5/13/chartex" xmlns:cx8="http://schemas.microsoft.com/office/drawing/2016/5/14/chartex" xmlns:mc="http://schemas.openxmlformats.org/markup-compatibility/2006" xmlns:aink="http://schemas.microsoft.com/office/drawing/2016/ink" xmlns:am3d="http://schemas.microsoft.com/office/drawing/2017/model3d" xmlns:o="urn:schemas-microsoft-com:office:office" xmlns:r="http://schemas.openxmlformats.org/officeDocument/2006/relationships" xmlns:m="http://schemas.openxmlformats.org/officeDocument/2006/math" xmlns:v="urn:schemas-microsoft-com:vml" xmlns:wp14="http://schemas.microsoft.com/office/word/2010/wordprocessingDrawing" xmlns:wp="http://schemas.openxmlformats.org/drawingml/2006/wordprocessingDrawing" xmlns:w10="urn:schemas-microsoft-com:office:word" xmlns:w="http://schemas.openxmlformats.org/wordprocessingml/2006/main" xmlns:w14="http://schemas.microsoft.com/office/word/2010/wordml" xmlns:w15="http://schemas.microsoft.com/office/word/2012/wordml" xmlns:w16cid="http://schemas.microsoft.com/office/word/2016/wordml/cid" xmlns:w16se="http://schemas.microsoft.com/office/word/2015/wordml/symex" xmlns:wpg="http://schemas.microsoft.com/office/word/2010/wordprocessingGroup" xmlns:wpi="http://schemas.microsoft.com/office/word/2010/wordprocessingInk" xmlns:wne="http://schemas.microsoft.com/office/word/2006/wordml" xmlns:wps="http://schemas.microsoft.com/office/word/2010/wordprocessingShape" mc:Ignorable="w14 w15 w16se w16cid wp14">
+  <w:endnote w:type="separator" w:id="-1">
+    <w:p>
+      <w:pPr>
+        <w:spacing w:after="0" w:line="240" w:lineRule="auto"/>
+      </w:pPr>
+      <w:r>
+        <w:separator/>
+      </w:r>
+    </w:p>
+  </w:endnote>
+  <w:endnote w:type="continuationSeparator" w:id="0">
+    <w:p>
+      <w:pPr>
+        <w:spacing w:after="0" w:line="240" w:lineRule="auto"/>
+      </w:pPr>
+      <w:r>
+        <w:continuationSeparator/>
+      </w:r>
+    </w:p>
+  </w:endnote>
+</w:endnotes>
+</file>
+
+<file path=word/footnotes.xml><?xml version="1.0" encoding="utf-8"?>
+<w:footnotes xmlns:wpc="http://schemas.microsoft.com/office/word/2010/wordprocessingCanvas" xmlns:cx="http://schemas.microsoft.com/office/drawing/2014/chartex" xmlns:cx1="http://schemas.microsoft.com/office/drawing/2015/9/8/chartex" xmlns:cx2="http://schemas.microsoft.com/office/drawing/2015/10/21/chartex" xmlns:cx3="http://schemas.microsoft.com/office/drawing/2016/5/9/chartex" xmlns:cx4="http://schemas.microsoft.com/office/drawing/2016/5/10/chartex" xmlns:cx5="http://schemas.microsoft.com/office/drawing/2016/5/11/chartex" xmlns:cx6="http://schemas.microsoft.com/office/drawing/2016/5/12/chartex" xmlns:cx7="http://schemas.microsoft.com/office/drawing/2016/5/13/chartex" xmlns:cx8="http://schemas.microsoft.com/office/drawing/2016/5/14/chartex" xmlns:mc="http://schemas.openxmlformats.org/markup-compatibility/2006" xmlns:aink="http://schemas.microsoft.com/office/drawing/2016/ink" xmlns:am3d="http://schemas.microsoft.com/office/drawing/2017/model3d" xmlns:o="urn:schemas-microsoft-com:office:office" xmlns:r="http://schemas.openxmlformats.org/officeDocument/2006/relationships" xmlns:m="http://schemas.openxmlformats.org/officeDocument/2006/math" xmlns:v="urn:schemas-microsoft-com:vml" xmlns:wp14="http://schemas.microsoft.com/office/word/2010/wordprocessingDrawing" xmlns:wp="http://schemas.openxmlformats.org/drawingml/2006/wordprocessingDrawing" xmlns:w10="urn:schemas-microsoft-com:office:word" xmlns:w="http://schemas.openxmlformats.org/wordprocessingml/2006/main" xmlns:w14="http://schemas.microsoft.com/office/word/2010/wordml" xmlns:w15="http://schemas.microsoft.com/office/word/2012/wordml" xmlns:w16cid="http://schemas.microsoft.com/office/word/2016/wordml/cid" xmlns:w16se="http://schemas.microsoft.com/office/word/2015/wordml/symex" xmlns:wpg="http://schemas.microsoft.com/office/word/2010/wordprocessingGroup" xmlns:wpi="http://schemas.microsoft.com/office/word/2010/wordprocessingInk" xmlns:wne="http://schemas.microsoft.com/office/word/2006/wordml" xmlns:wps="http://schemas.microsoft.com/office/word/2010/wordprocessingShape" mc:Ignorable="w14 w15 w16se w16cid wp14">
+  <w:footnote w:type="separator" w:id="-1">
+    <w:p>
+      <w:pPr>
+        <w:spacing w:after="0" w:line="240" w:lineRule="auto"/>
+      </w:pPr>
+      <w:r>
+        <w:separator/>
+      </w:r>
+    </w:p>
+  </w:footnote>
+  <w:footnote w:type="continuationSeparator" w:id="0">
+    <w:p>
+      <w:pPr>
+        <w:spacing w:after="0" w:line="240" w:lineRule="auto"/>
+      </w:pPr>
+      <w:r>
+        <w:continuationSeparator/>
+      </w:r>
+    </w:p>
+  </w:footnote>
+</w:footnotes>
+</file>
+
+<file path=word/header1.xml><?xml version="1.0" encoding="utf-8"?>
+<w:hdr xmlns:wpc="http://schemas.microsoft.com/office/word/2010/wordprocessingCanvas" xmlns:cx="http://schemas.microsoft.com/office/drawing/2014/chartex" xmlns:cx1="http://schemas.microsoft.com/office/drawing/2015/9/8/chartex" xmlns:cx2="http://schemas.microsoft.com/office/drawing/2015/10/21/chartex" xmlns:cx3="http://schemas.microsoft.com/office/drawing/2016/5/9/chartex" xmlns:cx4="http://schemas.microsoft.com/office/drawing/2016/5/10/chartex" xmlns:cx5="http://schemas.microsoft.com/office/drawing/2016/5/11/chartex" xmlns:cx6="http://schemas.microsoft.com/office/drawing/2016/5/12/chartex" xmlns:cx7="http://schemas.microsoft.com/office/drawing/2016/5/13/chartex" xmlns:cx8="http://schemas.microsoft.com/office/drawing/2016/5/14/chartex" xmlns:mc="http://schemas.openxmlformats.org/markup-compatibility/2006" xmlns:aink="http://schemas.microsoft.com/office/drawing/2016/ink" xmlns:am3d="http://schemas.microsoft.com/office/drawing/2017/model3d" xmlns:o="urn:schemas-microsoft-com:office:office" xmlns:r="http://schemas.openxmlformats.org/officeDocument/2006/relationships" xmlns:m="http://schemas.openxmlformats.org/officeDocument/2006/math" xmlns:v="urn:schemas-microsoft-com:vml" xmlns:wp14="http://schemas.microsoft.com/office/word/2010/wordprocessingDrawing" xmlns:wp="http://schemas.openxmlformats.org/drawingml/2006/wordprocessingDrawing" xmlns:w10="urn:schemas-microsoft-com:office:word" xmlns:w="http://schemas.openxmlformats.org/wordprocessingml/2006/main" xmlns:w14="http://schemas.microsoft.com/office/word/2010/wordml" xmlns:w15="http://schemas.microsoft.com/office/word/2012/wordml" xmlns:w16cid="http://schemas.microsoft.com/office/word/2016/wordml/cid" xmlns:w16se="http://schemas.microsoft.com/office/word/2015/wordml/symex" xmlns:wpg="http://schemas.microsoft.com/office/word/2010/wordprocessingGroup" xmlns:wpi="http://schemas.microsoft.com/office/word/2010/wordprocessingInk" xmlns:wne="http://schemas.microsoft.com/office/word/2006/wordml" xmlns:wps="http://schemas.microsoft.com/office/word/2010/wordprocessingShape" mc:Ignorable="w14 w15 w16se w16cid wp14">
+  <w:tbl>
+    <w:tblPr>
+      <w:tblStyle w:val="Tabelacomgrade"/>
+      <w:tblW w:w="9244" w:type="dxa"/>
+      <w:tblInd w:w="-5" w:type="dxa"/>
+      <w:tblLook w:val="04A0" w:firstRow="1" w:lastRow="0" w:firstColumn="1" w:lastColumn="0" w:noHBand="0" w:noVBand="1"/>
+    </w:tblPr>
+    <w:tblGrid>
+      <w:gridCol w:w="4536"/>
+      <w:gridCol w:w="4708"/>
+    </w:tblGrid>
+    <w:tr>
+      <w:trPr>
+        <w:trHeight w:val="1124"/>
+      </w:trPr>
+      <w:tc>
+        <w:tcPr>
+          <w:tcW w:w="4536" w:type="dxa"/>
+          <w:tcBorders>
+            <w:right w:val="single" w:sz="4" w:space="0" w:color="auto"/>
+          </w:tcBorders>
+        </w:tcPr>
+        <w:p>
+          <w:pPr>
+            <w:jc w:val="center"/>
+            <w:rPr>
+              <w:rFonts w:ascii="Times New Roman" w:hAnsi="Times New Roman" w:cs="Times New Roman"/>
+              <w:b/>
+            </w:rPr>
+          </w:pPr>
+        </w:p>
+        <w:p>
+          <w:pPr>
+            <w:jc w:val="center"/>
+            <w:rPr>
+              <w:rFonts w:ascii="Times New Roman" w:hAnsi="Times New Roman" w:cs="Times New Roman"/>
+              <w:b/>
+              <w:sz w:val="24"/>
+              <w:szCs w:val="24"/>
+            </w:rPr>
+          </w:pPr>
+          <w:r>
+            <w:rPr>
+              <w:rFonts w:ascii="Times New Roman" w:hAnsi="Times New Roman" w:cs="Times New Roman"/>
+              <w:b/>
+              <w:sz w:val="24"/>
+              <w:szCs w:val="24"/>
+            </w:rPr>
+            <w:t>DECLARAÇÃO DO ESCOPO DO PROJETO</w:t>
+          </w:r>
+        </w:p>
+        <w:p>
+          <w:pPr>
+            <w:jc w:val="center"/>
+            <w:rPr>
+              <w:rFonts w:ascii="Times New Roman" w:hAnsi="Times New Roman" w:cs="Times New Roman"/>
+            </w:rPr>
+          </w:pPr>
+        </w:p>
+      </w:tc>
+      <w:tc>
+        <w:tcPr>
+          <w:tcW w:w="4708" w:type="dxa"/>
+          <w:tcBorders>
+            <w:top w:val="single" w:sz="4" w:space="0" w:color="auto"/>
+            <w:left w:val="single" w:sz="4" w:space="0" w:color="auto"/>
+            <w:bottom w:val="nil"/>
+            <w:right w:val="single" w:sz="4" w:space="0" w:color="auto"/>
+          </w:tcBorders>
+        </w:tcPr>
+        <w:p/>
+      </w:tc>
+    </w:tr>
+    <w:tr>
+      <w:trPr>
+        <w:trHeight w:val="599"/>
+      </w:trPr>
+      <w:tc>
+        <w:tcPr>
+          <w:tcW w:w="4536" w:type="dxa"/>
+          <w:tcBorders>
+            <w:right w:val="single" w:sz="4" w:space="0" w:color="auto"/>
+          </w:tcBorders>
+        </w:tcPr>
+        <w:p>
+          <w:pPr>
+            <w:rPr>
+              <w:rFonts w:ascii="Times New Roman" w:hAnsi="Times New Roman" w:cs="Times New Roman"/>
+            </w:rPr>
+          </w:pPr>
+        </w:p>
+        <w:p>
+          <w:pPr>
+            <w:jc w:val="center"/>
+            <w:rPr>
+              <w:rFonts w:ascii="Times New Roman" w:hAnsi="Times New Roman" w:cs="Times New Roman"/>
+              <w:b/>
+              <w:sz w:val="24"/>
+              <w:szCs w:val="24"/>
+            </w:rPr>
+          </w:pPr>
+          <w:r>
+            <w:rPr>
+              <w:rFonts w:ascii="Times New Roman" w:hAnsi="Times New Roman" w:cs="Times New Roman"/>
+              <w:b/>
+              <w:sz w:val="24"/>
+              <w:szCs w:val="24"/>
+            </w:rPr>
+            <w:t>CRIAÇÃO DO DESHBOARD (AgroFlux)</w:t>
+          </w:r>
+        </w:p>
+        <w:p>
+          <w:pPr>
+            <w:rPr>
+              <w:rFonts w:ascii="Times New Roman" w:hAnsi="Times New Roman" w:cs="Times New Roman"/>
+            </w:rPr>
+          </w:pPr>
+        </w:p>
+      </w:tc>
+      <w:tc>
+        <w:tcPr>
+          <w:tcW w:w="4708" w:type="dxa"/>
+          <w:tcBorders>
+            <w:top w:val="nil"/>
+            <w:left w:val="single" w:sz="4" w:space="0" w:color="auto"/>
+            <w:bottom w:val="single" w:sz="4" w:space="0" w:color="auto"/>
+            <w:right w:val="single" w:sz="4" w:space="0" w:color="auto"/>
+          </w:tcBorders>
+        </w:tcPr>
+        <w:p>
+          <w:pPr>
+            <w:pStyle w:val="NormalWeb"/>
+          </w:pPr>
+          <w:r>
+            <w:rPr>
+              <w:noProof/>
+            </w:rPr>
+            <mc:AlternateContent>
+              <mc:Choice Requires="wps">
+                <w:drawing>
+                  <wp:inline distT="0" distB="0" distL="0" distR="0" wp14:anchorId="081B1030" wp14:editId="1148A8A1">
+                    <wp:extent cx="304800" cy="304800"/>
+                    <wp:effectExtent l="0" t="0" r="0" b="0"/>
+                    <wp:docPr id="1" name="Retângulo 1" descr="Green_Illustrated_Harvest_Hill_Logo.png"/>
+                    <wp:cNvGraphicFramePr>
+                      <a:graphicFrameLocks xmlns:a="http://schemas.openxmlformats.org/drawingml/2006/main" noChangeAspect="1"/>
+                    </wp:cNvGraphicFramePr>
+                    <a:graphic xmlns:a="http://schemas.openxmlformats.org/drawingml/2006/main">
+                      <a:graphicData uri="http://schemas.microsoft.com/office/word/2010/wordprocessingShape">
+                        <wps:wsp>
+                          <wps:cNvSpPr>
+                            <a:spLocks noChangeAspect="1" noChangeArrowheads="1"/>
+                          </wps:cNvSpPr>
+                          <wps:spPr bwMode="auto">
+                            <a:xfrm>
+                              <a:off x="0" y="0"/>
+                              <a:ext cx="304800" cy="304800"/>
+                            </a:xfrm>
+                            <a:prstGeom prst="rect">
+                              <a:avLst/>
+                            </a:prstGeom>
+                            <a:noFill/>
+                            <a:ln>
+                              <a:noFill/>
+                            </a:ln>
+                            <a:extLst>
+                              <a:ext uri="{909E8E84-426E-40DD-AFC4-6F175D3DCCD1}">
+                                <a14:hiddenFill xmlns:a14="http://schemas.microsoft.com/office/drawing/2010/main">
+                                  <a:solidFill>
+                                    <a:srgbClr val="FFFFFF"/>
+                                  </a:solidFill>
+                                </a14:hiddenFill>
+                              </a:ext>
+                              <a:ext uri="{91240B29-F687-4F45-9708-019B960494DF}">
+                                <a14:hiddenLine xmlns:a14="http://schemas.microsoft.com/office/drawing/2010/main" w="9525">
+                                  <a:solidFill>
+                                    <a:srgbClr val="000000"/>
+                                  </a:solidFill>
+                                  <a:miter lim="800000"/>
+                                  <a:headEnd/>
+                                  <a:tailEnd/>
+                                </a14:hiddenLine>
+                              </a:ext>
+                            </a:extLst>
+                          </wps:spPr>
+                          <wps:bodyPr rot="0" vert="horz" wrap="square" lIns="91440" tIns="45720" rIns="91440" bIns="45720" anchor="t" anchorCtr="0" upright="1">
+                            <a:noAutofit/>
+                          </wps:bodyPr>
+                        </wps:wsp>
+                      </a:graphicData>
+                    </a:graphic>
+                  </wp:inline>
+                </w:drawing>
+              </mc:Choice>
+              <mc:Fallback>
+                <w:pict>
+                  <v:rect w14:anchorId="1245E26D" id="Retângulo 1" o:spid="_x0000_s1026" alt="Green_Illustrated_Harvest_Hill_Logo.png" style="width:24pt;height:24pt;visibility:visible;mso-wrap-style:square;mso-left-percent:-10001;mso-top-percent:-10001;mso-position-horizontal:absolute;mso-position-horizontal-relative:char;mso-position-vertical:absolute;mso-position-vertical-relative:line;mso-left-percent:-10001;mso-top-percent:-10001;v-text-anchor:top" o:gfxdata="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" filled="f" stroked="f">
+                    <o:lock v:ext="edit" aspectratio="t"/>
+                    <w10:anchorlock/>
+                  </v:rect>
+                </w:pict>
+              </mc:Fallback>
+            </mc:AlternateContent>
+          </w:r>
+        </w:p>
+        <w:p/>
+      </w:tc>
+    </w:tr>
+  </w:tbl>
+  <w:p>
+    <w:pPr>
+      <w:pStyle w:val="Cabealho"/>
+    </w:pPr>
+  </w:p>
+</w:hdr>
 </file>
 
 <file path=word/styles.xml><?xml version="1.0" encoding="utf-8"?>
@@ -2635,6 +2948,50 @@
       <w:lang w:eastAsia="pt-BR"/>
     </w:rPr>
   </w:style>
+  <w:style w:type="paragraph" w:styleId="Cabealho">
+    <w:name w:val="header"/>
+    <w:basedOn w:val="Normal"/>
+    <w:link w:val="CabealhoChar"/>
+    <w:uiPriority w:val="99"/>
+    <w:unhideWhenUsed/>
+    <w:rsid w:val="0010066A"/>
+    <w:pPr>
+      <w:tabs>
+        <w:tab w:val="center" w:pos="4252"/>
+        <w:tab w:val="right" w:pos="8504"/>
+      </w:tabs>
+      <w:spacing w:after="0" w:line="240" w:lineRule="auto"/>
+    </w:pPr>
+  </w:style>
+  <w:style w:type="character" w:customStyle="1" w:styleId="CabealhoChar">
+    <w:name w:val="Cabeçalho Char"/>
+    <w:basedOn w:val="Fontepargpadro"/>
+    <w:link w:val="Cabealho"/>
+    <w:uiPriority w:val="99"/>
+    <w:rsid w:val="0010066A"/>
+  </w:style>
+  <w:style w:type="paragraph" w:styleId="Rodap">
+    <w:name w:val="footer"/>
+    <w:basedOn w:val="Normal"/>
+    <w:link w:val="RodapChar"/>
+    <w:uiPriority w:val="99"/>
+    <w:unhideWhenUsed/>
+    <w:rsid w:val="0010066A"/>
+    <w:pPr>
+      <w:tabs>
+        <w:tab w:val="center" w:pos="4252"/>
+        <w:tab w:val="right" w:pos="8504"/>
+      </w:tabs>
+      <w:spacing w:after="0" w:line="240" w:lineRule="auto"/>
+    </w:pPr>
+  </w:style>
+  <w:style w:type="character" w:customStyle="1" w:styleId="RodapChar">
+    <w:name w:val="Rodapé Char"/>
+    <w:basedOn w:val="Fontepargpadro"/>
+    <w:link w:val="Rodap"/>
+    <w:uiPriority w:val="99"/>
+    <w:rsid w:val="0010066A"/>
+  </w:style>
 </w:styles>
 </file>
 

</xml_diff>